<commit_message>
Agregado de notas de consulta 20-5 y agregado de comentarios menores al código.
</commit_message>
<xml_diff>
--- a/TP2/Entregable.docx
+++ b/TP2/Entregable.docx
@@ -323,14 +323,7 @@
               <w:sz w:val="32"/>
               <w:lang w:val="es-MX"/>
             </w:rPr>
-            <w:t xml:space="preserve"> de Fase en el Dominio de la </w:t>
-          </w:r>
-          <w:r>
-            <w:rPr>
-              <w:sz w:val="32"/>
-              <w:lang w:val="es-MX"/>
-            </w:rPr>
-            <w:t>Frecuencia</w:t>
+            <w:t xml:space="preserve"> de Fase en el Dominio de la Frecuencia</w:t>
           </w:r>
           <w:r>
             <w:rPr>
@@ -437,21 +430,247 @@
       <w:r>
         <w:br w:type="page"/>
       </w:r>
-      <w:bookmarkStart w:id="0" w:name="_GoBack"/>
+    </w:p>
+    <w:p>
+      <w:pPr>
+        <w:pStyle w:val="Ttulo1"/>
+      </w:pPr>
+      <w:bookmarkStart w:id="0" w:name="_Toc230080423"/>
+      <w:r>
+        <w:lastRenderedPageBreak/>
+        <w:t>Introducción:</w:t>
+      </w:r>
       <w:bookmarkEnd w:id="0"/>
     </w:p>
+    <w:p/>
+    <w:p/>
     <w:p>
       <w:pPr>
         <w:pStyle w:val="Ttulo1"/>
       </w:pPr>
-      <w:bookmarkStart w:id="1" w:name="_Toc230080423"/>
-      <w:r>
-        <w:lastRenderedPageBreak/>
-        <w:t>Introducción:</w:t>
+      <w:r>
+        <w:t>Inciso 1:</w:t>
+      </w:r>
+    </w:p>
+    <w:p>
+      <w:pPr>
+        <w:rPr>
+          <w:b/>
+        </w:rPr>
+      </w:pPr>
+      <w:r>
+        <w:rPr>
+          <w:b/>
+        </w:rPr>
+        <w:t>“Estimación</w:t>
+      </w:r>
+      <w:r>
+        <w:rPr>
+          <w:b/>
+        </w:rPr>
+        <w:t xml:space="preserve"> de </w:t>
+      </w:r>
+      <w:r>
+        <w:rPr>
+          <w:b/>
+        </w:rPr>
+        <w:t>traslación</w:t>
+      </w:r>
+      <w:r>
+        <w:rPr>
+          <w:b/>
+        </w:rPr>
+        <w:t xml:space="preserve"> mediante </w:t>
+      </w:r>
+      <w:r>
+        <w:rPr>
+          <w:b/>
+        </w:rPr>
+        <w:t>correlación</w:t>
+      </w:r>
+      <w:r>
+        <w:rPr>
+          <w:b/>
+        </w:rPr>
+        <w:t xml:space="preserve"> de fase: Dadas dos </w:t>
+      </w:r>
+      <w:r>
+        <w:rPr>
+          <w:b/>
+        </w:rPr>
+        <w:t>imágenes</w:t>
+      </w:r>
+      <w:r>
+        <w:rPr>
+          <w:b/>
+        </w:rPr>
+        <w:t xml:space="preserve"> f1(x, y) y f2(x, y)</w:t>
+      </w:r>
+      <w:r>
+        <w:rPr>
+          <w:b/>
+        </w:rPr>
+        <w:t xml:space="preserve"> </w:t>
+      </w:r>
+      <w:r>
+        <w:rPr>
+          <w:b/>
+        </w:rPr>
+        <w:t xml:space="preserve">relacionadas por un desplazamiento (x0, y0), implemente un </w:t>
+      </w:r>
+      <w:r>
+        <w:rPr>
+          <w:b/>
+        </w:rPr>
+        <w:t>código</w:t>
+      </w:r>
+      <w:r>
+        <w:rPr>
+          <w:b/>
+        </w:rPr>
+        <w:t xml:space="preserve"> que determine dicho vector de </w:t>
+      </w:r>
+      <w:r>
+        <w:rPr>
+          <w:b/>
+        </w:rPr>
+        <w:t xml:space="preserve">traslación. </w:t>
+      </w:r>
+      <w:r>
+        <w:rPr>
+          <w:b/>
+        </w:rPr>
+        <w:t xml:space="preserve">Utilice </w:t>
+      </w:r>
+      <w:bookmarkStart w:id="1" w:name="_GoBack"/>
+      <w:r>
+        <w:rPr>
+          <w:b/>
+        </w:rPr>
+        <w:t xml:space="preserve">el espectro cruzado normalizado utilizando las transformadas de Fourier </w:t>
       </w:r>
       <w:bookmarkEnd w:id="1"/>
+      <w:r>
+        <w:rPr>
+          <w:b/>
+        </w:rPr>
+        <w:t xml:space="preserve">de las </w:t>
+      </w:r>
+      <w:r>
+        <w:rPr>
+          <w:b/>
+        </w:rPr>
+        <w:t xml:space="preserve">imágenes para localizar </w:t>
+      </w:r>
+      <w:r>
+        <w:rPr>
+          <w:b/>
+        </w:rPr>
+        <w:t xml:space="preserve">el desplazamiento. Explique </w:t>
+      </w:r>
+      <w:r>
+        <w:rPr>
+          <w:b/>
+        </w:rPr>
+        <w:t>teóricamente</w:t>
+      </w:r>
+      <w:r>
+        <w:rPr>
+          <w:b/>
+        </w:rPr>
+        <w:t xml:space="preserve"> por </w:t>
+      </w:r>
+      <w:r>
+        <w:rPr>
+          <w:b/>
+        </w:rPr>
+        <w:t>qué</w:t>
+      </w:r>
+      <w:r>
+        <w:rPr>
+          <w:b/>
+        </w:rPr>
+        <w:t xml:space="preserve"> la magnitud del espectro de Fourier |</w:t>
+      </w:r>
+      <w:r>
+        <w:rPr>
+          <w:b/>
+        </w:rPr>
+        <w:t>F (</w:t>
+      </w:r>
+      <w:r>
+        <w:rPr>
+          <w:b/>
+        </w:rPr>
+        <w:t xml:space="preserve">u, </w:t>
+      </w:r>
+      <w:r>
+        <w:rPr>
+          <w:b/>
+        </w:rPr>
+        <w:t>v) |</w:t>
+      </w:r>
+      <w:r>
+        <w:rPr>
+          <w:b/>
+        </w:rPr>
+        <w:t xml:space="preserve"> </w:t>
+      </w:r>
+      <w:r>
+        <w:rPr>
+          <w:b/>
+        </w:rPr>
+        <w:t xml:space="preserve">es invariante </w:t>
+      </w:r>
+      <w:r>
+        <w:rPr>
+          <w:b/>
+        </w:rPr>
+        <w:t xml:space="preserve">a las traslaciones espaciales. Escriba un algoritmo que calcule el vector </w:t>
+      </w:r>
+      <w:r>
+        <w:rPr>
+          <w:b/>
+        </w:rPr>
+        <w:t>desplazamiento,</w:t>
+      </w:r>
+      <w:r>
+        <w:rPr>
+          <w:b/>
+        </w:rPr>
+        <w:t xml:space="preserve"> pero con una </w:t>
+      </w:r>
+      <w:r>
+        <w:rPr>
+          <w:b/>
+        </w:rPr>
+        <w:t xml:space="preserve">lógica </w:t>
+      </w:r>
+      <w:r>
+        <w:rPr>
+          <w:b/>
+        </w:rPr>
+        <w:t xml:space="preserve">espacial de </w:t>
+      </w:r>
+      <w:r>
+        <w:rPr>
+          <w:b/>
+        </w:rPr>
+        <w:t>comparación</w:t>
+      </w:r>
+      <w:r>
+        <w:rPr>
+          <w:b/>
+        </w:rPr>
+        <w:t xml:space="preserve"> de pixeles, y compare el costo computacional con el algoritmo anterior.</w:t>
+      </w:r>
+      <w:r>
+        <w:rPr>
+          <w:b/>
+        </w:rPr>
+        <w:t>”</w:t>
+      </w:r>
     </w:p>
-    <w:p/>
     <w:sectPr>
       <w:footerReference w:type="default" r:id="rId9"/>
       <w:pgSz w:w="11906" w:h="16838"/>
@@ -4384,7 +4603,7 @@
 </file>
 
 <file path=customXml/itemProps1.xml><?xml version="1.0" encoding="utf-8"?>
-<ds:datastoreItem xmlns:ds="http://schemas.openxmlformats.org/officeDocument/2006/customXml" ds:itemID="{3E722AAA-6611-41D0-A674-1AC5A08B0539}">
+<ds:datastoreItem xmlns:ds="http://schemas.openxmlformats.org/officeDocument/2006/customXml" ds:itemID="{E650745C-BFE6-43C8-82FA-3A7662024B79}">
   <ds:schemaRefs>
     <ds:schemaRef ds:uri="http://schemas.openxmlformats.org/officeDocument/2006/bibliography"/>
   </ds:schemaRefs>

</xml_diff>

<commit_message>
Agregado de chequeo para item 1
</commit_message>
<xml_diff>
--- a/TP2/Entregable.docx
+++ b/TP2/Entregable.docx
@@ -462,215 +462,27 @@
         <w:rPr>
           <w:b/>
         </w:rPr>
-        <w:t>“Estimación</w:t>
+        <w:t>“Estimación de traslación mediante correlación de fase: Dadas dos imágenes f1(x, y) y f2(x, y) relacionadas por un desplazamiento (x0, y0), implemente un código que determine dicho vector de traslación. Utilice el espectro cruzado normalizado utilizando las transformadas de Fourier de las imágenes para localizar el desplazamiento. Explique teóricamente por qué la magnitud del espectro de Fourier |F (u, v) | es invariante a las traslaciones espaciales. Escriba un algoritmo que calcule el vector desplazamiento, pero con una lógica espacial de comparación de pixeles, y compare el costo computacional con el algoritmo anterior.”</w:t>
       </w:r>
+    </w:p>
+    <w:p>
       <w:r>
-        <w:rPr>
-          <w:b/>
-        </w:rPr>
-        <w:t xml:space="preserve"> de </w:t>
+        <w:t xml:space="preserve">Comenzamos creando un código para cargar las imágenes en Python utilizando una funcionalidad de </w:t>
       </w:r>
+      <w:proofErr w:type="spellStart"/>
       <w:r>
-        <w:rPr>
-          <w:b/>
-        </w:rPr>
-        <w:t>traslación</w:t>
+        <w:t>openCV</w:t>
       </w:r>
+      <w:proofErr w:type="spellEnd"/>
       <w:r>
-        <w:rPr>
-          <w:b/>
-        </w:rPr>
-        <w:t xml:space="preserve"> mediante </w:t>
-      </w:r>
-      <w:r>
-        <w:rPr>
-          <w:b/>
-        </w:rPr>
-        <w:t>correlación</w:t>
-      </w:r>
-      <w:r>
-        <w:rPr>
-          <w:b/>
-        </w:rPr>
-        <w:t xml:space="preserve"> de fase: Dadas dos </w:t>
-      </w:r>
-      <w:r>
-        <w:rPr>
-          <w:b/>
-        </w:rPr>
-        <w:t>imágenes</w:t>
-      </w:r>
-      <w:r>
-        <w:rPr>
-          <w:b/>
-        </w:rPr>
-        <w:t xml:space="preserve"> f1(x, y) y f2(x, y)</w:t>
-      </w:r>
-      <w:r>
-        <w:rPr>
-          <w:b/>
-        </w:rPr>
-        <w:t xml:space="preserve"> </w:t>
-      </w:r>
-      <w:r>
-        <w:rPr>
-          <w:b/>
-        </w:rPr>
-        <w:t xml:space="preserve">relacionadas por un desplazamiento (x0, y0), implemente un </w:t>
-      </w:r>
-      <w:r>
-        <w:rPr>
-          <w:b/>
-        </w:rPr>
-        <w:t>código</w:t>
-      </w:r>
-      <w:r>
-        <w:rPr>
-          <w:b/>
-        </w:rPr>
-        <w:t xml:space="preserve"> que determine dicho vector de </w:t>
-      </w:r>
-      <w:r>
-        <w:rPr>
-          <w:b/>
-        </w:rPr>
-        <w:t xml:space="preserve">traslación. </w:t>
-      </w:r>
-      <w:r>
-        <w:rPr>
-          <w:b/>
-        </w:rPr>
-        <w:t xml:space="preserve">Utilice </w:t>
+        <w:t>. Luego creamos otro código donde haríamos las distintas funcionalidades del inciso 1</w:t>
       </w:r>
       <w:bookmarkStart w:id="1" w:name="_GoBack"/>
-      <w:r>
-        <w:rPr>
-          <w:b/>
-        </w:rPr>
-        <w:t xml:space="preserve">el espectro cruzado normalizado utilizando las transformadas de Fourier </w:t>
-      </w:r>
       <w:bookmarkEnd w:id="1"/>
-      <w:r>
-        <w:rPr>
-          <w:b/>
-        </w:rPr>
-        <w:t xml:space="preserve">de las </w:t>
-      </w:r>
-      <w:r>
-        <w:rPr>
-          <w:b/>
-        </w:rPr>
-        <w:t xml:space="preserve">imágenes para localizar </w:t>
-      </w:r>
-      <w:r>
-        <w:rPr>
-          <w:b/>
-        </w:rPr>
-        <w:t xml:space="preserve">el desplazamiento. Explique </w:t>
-      </w:r>
-      <w:r>
-        <w:rPr>
-          <w:b/>
-        </w:rPr>
-        <w:t>teóricamente</w:t>
-      </w:r>
-      <w:r>
-        <w:rPr>
-          <w:b/>
-        </w:rPr>
-        <w:t xml:space="preserve"> por </w:t>
-      </w:r>
-      <w:r>
-        <w:rPr>
-          <w:b/>
-        </w:rPr>
-        <w:t>qué</w:t>
-      </w:r>
-      <w:r>
-        <w:rPr>
-          <w:b/>
-        </w:rPr>
-        <w:t xml:space="preserve"> la magnitud del espectro de Fourier |</w:t>
-      </w:r>
-      <w:r>
-        <w:rPr>
-          <w:b/>
-        </w:rPr>
-        <w:t>F (</w:t>
-      </w:r>
-      <w:r>
-        <w:rPr>
-          <w:b/>
-        </w:rPr>
-        <w:t xml:space="preserve">u, </w:t>
-      </w:r>
-      <w:r>
-        <w:rPr>
-          <w:b/>
-        </w:rPr>
-        <w:t>v) |</w:t>
-      </w:r>
-      <w:r>
-        <w:rPr>
-          <w:b/>
-        </w:rPr>
-        <w:t xml:space="preserve"> </w:t>
-      </w:r>
-      <w:r>
-        <w:rPr>
-          <w:b/>
-        </w:rPr>
-        <w:t xml:space="preserve">es invariante </w:t>
-      </w:r>
-      <w:r>
-        <w:rPr>
-          <w:b/>
-        </w:rPr>
-        <w:t xml:space="preserve">a las traslaciones espaciales. Escriba un algoritmo que calcule el vector </w:t>
-      </w:r>
-      <w:r>
-        <w:rPr>
-          <w:b/>
-        </w:rPr>
-        <w:t>desplazamiento,</w:t>
-      </w:r>
-      <w:r>
-        <w:rPr>
-          <w:b/>
-        </w:rPr>
-        <w:t xml:space="preserve"> pero con una </w:t>
-      </w:r>
-      <w:r>
-        <w:rPr>
-          <w:b/>
-        </w:rPr>
-        <w:t xml:space="preserve">lógica </w:t>
-      </w:r>
-      <w:r>
-        <w:rPr>
-          <w:b/>
-        </w:rPr>
-        <w:t xml:space="preserve">espacial de </w:t>
-      </w:r>
-      <w:r>
-        <w:rPr>
-          <w:b/>
-        </w:rPr>
-        <w:t>comparación</w:t>
-      </w:r>
-      <w:r>
-        <w:rPr>
-          <w:b/>
-        </w:rPr>
-        <w:t xml:space="preserve"> de pixeles, y compare el costo computacional con el algoritmo anterior.</w:t>
-      </w:r>
-      <w:r>
-        <w:rPr>
-          <w:b/>
-        </w:rPr>
-        <w:t>”</w:t>
-      </w:r>
     </w:p>
+    <w:p/>
+    <w:p/>
+    <w:p/>
     <w:sectPr>
       <w:footerReference w:type="default" r:id="rId9"/>
       <w:pgSz w:w="11906" w:h="16838"/>
@@ -4603,7 +4415,7 @@
 </file>
 
 <file path=customXml/itemProps1.xml><?xml version="1.0" encoding="utf-8"?>
-<ds:datastoreItem xmlns:ds="http://schemas.openxmlformats.org/officeDocument/2006/customXml" ds:itemID="{E650745C-BFE6-43C8-82FA-3A7662024B79}">
+<ds:datastoreItem xmlns:ds="http://schemas.openxmlformats.org/officeDocument/2006/customXml" ds:itemID="{E36221D3-DEC1-423F-8B23-A307277C922A}">
   <ds:schemaRefs>
     <ds:schemaRef ds:uri="http://schemas.openxmlformats.org/officeDocument/2006/bibliography"/>
   </ds:schemaRefs>

</xml_diff>

<commit_message>
Completado de inciso 1 e inciso 2.
</commit_message>
<xml_diff>
--- a/TP2/Entregable.docx
+++ b/TP2/Entregable.docx
@@ -355,7 +355,7 @@
           <w:r>
             <w:fldChar w:fldCharType="separate"/>
           </w:r>
-          <w:hyperlink w:anchor="_Toc230080423" w:history="1">
+          <w:hyperlink w:anchor="_Toc230691750" w:history="1">
             <w:r>
               <w:rPr>
                 <w:rStyle w:val="Hipervnculo"/>
@@ -382,7 +382,7 @@
                 <w:noProof/>
                 <w:webHidden/>
               </w:rPr>
-              <w:instrText xml:space="preserve"> PAGEREF _Toc230080423 \h </w:instrText>
+              <w:instrText xml:space="preserve"> PAGEREF _Toc230691750 \h </w:instrText>
             </w:r>
             <w:r>
               <w:rPr>
@@ -414,6 +414,162 @@
           </w:hyperlink>
         </w:p>
         <w:p>
+          <w:pPr>
+            <w:pStyle w:val="TDC1"/>
+            <w:tabs>
+              <w:tab w:val="right" w:leader="dot" w:pos="8494"/>
+            </w:tabs>
+            <w:rPr>
+              <w:rFonts w:asciiTheme="minorHAnsi" w:eastAsiaTheme="minorEastAsia" w:hAnsiTheme="minorHAnsi"/>
+              <w:noProof/>
+              <w:sz w:val="22"/>
+              <w:lang w:eastAsia="es-AR"/>
+            </w:rPr>
+          </w:pPr>
+          <w:hyperlink w:anchor="_Toc230691751" w:history="1">
+            <w:r>
+              <w:rPr>
+                <w:rStyle w:val="Hipervnculo"/>
+                <w:noProof/>
+              </w:rPr>
+              <w:t>Inciso 1:</w:t>
+            </w:r>
+            <w:r>
+              <w:rPr>
+                <w:noProof/>
+                <w:webHidden/>
+              </w:rPr>
+              <w:tab/>
+            </w:r>
+            <w:r>
+              <w:rPr>
+                <w:noProof/>
+                <w:webHidden/>
+              </w:rPr>
+              <w:fldChar w:fldCharType="begin"/>
+            </w:r>
+            <w:r>
+              <w:rPr>
+                <w:noProof/>
+                <w:webHidden/>
+              </w:rPr>
+              <w:instrText xml:space="preserve"> PAGEREF _Toc230691751 \h </w:instrText>
+            </w:r>
+            <w:r>
+              <w:rPr>
+                <w:noProof/>
+                <w:webHidden/>
+              </w:rPr>
+            </w:r>
+            <w:r>
+              <w:rPr>
+                <w:noProof/>
+                <w:webHidden/>
+              </w:rPr>
+              <w:fldChar w:fldCharType="separate"/>
+            </w:r>
+            <w:r>
+              <w:rPr>
+                <w:noProof/>
+                <w:webHidden/>
+              </w:rPr>
+              <w:t>3</w:t>
+            </w:r>
+            <w:r>
+              <w:rPr>
+                <w:noProof/>
+                <w:webHidden/>
+              </w:rPr>
+              <w:fldChar w:fldCharType="end"/>
+            </w:r>
+          </w:hyperlink>
+        </w:p>
+        <w:p>
+          <w:pPr>
+            <w:pStyle w:val="TDC1"/>
+            <w:tabs>
+              <w:tab w:val="right" w:leader="dot" w:pos="8494"/>
+            </w:tabs>
+            <w:rPr>
+              <w:rFonts w:asciiTheme="minorHAnsi" w:eastAsiaTheme="minorEastAsia" w:hAnsiTheme="minorHAnsi"/>
+              <w:noProof/>
+              <w:sz w:val="22"/>
+              <w:lang w:eastAsia="es-AR"/>
+            </w:rPr>
+          </w:pPr>
+          <w:hyperlink w:anchor="_Toc230691752" w:history="1">
+            <w:r>
+              <w:rPr>
+                <w:rStyle w:val="Hipervnculo"/>
+                <w:noProof/>
+              </w:rPr>
+              <w:t xml:space="preserve">Inciso </w:t>
+            </w:r>
+            <w:r>
+              <w:rPr>
+                <w:rStyle w:val="Hipervnculo"/>
+                <w:noProof/>
+              </w:rPr>
+              <w:t>2</w:t>
+            </w:r>
+            <w:r>
+              <w:rPr>
+                <w:rStyle w:val="Hipervnculo"/>
+                <w:noProof/>
+              </w:rPr>
+              <w:t>:</w:t>
+            </w:r>
+            <w:r>
+              <w:rPr>
+                <w:noProof/>
+                <w:webHidden/>
+              </w:rPr>
+              <w:tab/>
+            </w:r>
+            <w:r>
+              <w:rPr>
+                <w:noProof/>
+                <w:webHidden/>
+              </w:rPr>
+              <w:fldChar w:fldCharType="begin"/>
+            </w:r>
+            <w:r>
+              <w:rPr>
+                <w:noProof/>
+                <w:webHidden/>
+              </w:rPr>
+              <w:instrText xml:space="preserve"> PAGEREF _Toc230691752 \h </w:instrText>
+            </w:r>
+            <w:r>
+              <w:rPr>
+                <w:noProof/>
+                <w:webHidden/>
+              </w:rPr>
+            </w:r>
+            <w:r>
+              <w:rPr>
+                <w:noProof/>
+                <w:webHidden/>
+              </w:rPr>
+              <w:fldChar w:fldCharType="separate"/>
+            </w:r>
+            <w:r>
+              <w:rPr>
+                <w:noProof/>
+                <w:webHidden/>
+              </w:rPr>
+              <w:t>4</w:t>
+            </w:r>
+            <w:r>
+              <w:rPr>
+                <w:noProof/>
+                <w:webHidden/>
+              </w:rPr>
+              <w:fldChar w:fldCharType="end"/>
+            </w:r>
+          </w:hyperlink>
+        </w:p>
+        <w:p>
           <w:r>
             <w:rPr>
               <w:b/>
@@ -435,7 +591,7 @@
       <w:pPr>
         <w:pStyle w:val="Ttulo1"/>
       </w:pPr>
-      <w:bookmarkStart w:id="0" w:name="_Toc230080423"/>
+      <w:bookmarkStart w:id="0" w:name="_Toc230691750"/>
       <w:r>
         <w:lastRenderedPageBreak/>
         <w:t>Introducción:</w:t>
@@ -448,9 +604,11 @@
       <w:pPr>
         <w:pStyle w:val="Ttulo1"/>
       </w:pPr>
+      <w:bookmarkStart w:id="1" w:name="_Toc230691751"/>
       <w:r>
         <w:t>Inciso 1:</w:t>
       </w:r>
+      <w:bookmarkEnd w:id="1"/>
     </w:p>
     <w:p>
       <w:pPr>
@@ -462,7 +620,13 @@
         <w:rPr>
           <w:b/>
         </w:rPr>
-        <w:t>“Estimación de traslación mediante correlación de fase: Dadas dos imágenes f1(x, y) y f2(x, y) relacionadas por un desplazamiento (x0, y0), implemente un código que determine dicho vector de traslación. Utilice el espectro cruzado normalizado utilizando las transformadas de Fourier de las imágenes para localizar el desplazamiento. Explique teóricamente por qué la magnitud del espectro de Fourier |F (u, v) | es invariante a las traslaciones espaciales. Escriba un algoritmo que calcule el vector desplazamiento, pero con una lógica espacial de comparación de pixeles, y compare el costo computacional con el algoritmo anterior.”</w:t>
+        <w:t>Estimación de traslación mediante correlación de fase: Dadas dos imágenes f1(x, y) y f2(x, y) relacionadas por un desplazamiento (x0, y0), implemente un código que determine dicho vector de traslación. Utilice el espectro cruzado normalizado utilizando las transformadas de Fourier de las imágenes para localizar el desplazamiento. Explique teóricamente por qué la magnitud del espectro de Fourier |F (u, v) | es invariante a las traslaciones espaciales. Escriba un algoritmo que calcule el vector desplazamiento, pero con una lógica espacial de comparación de pixeles, y compare el costo computaci</w:t>
+      </w:r>
+      <w:r>
+        <w:rPr>
+          <w:b/>
+        </w:rPr>
+        <w:t>onal con el algoritmo anterior.</w:t>
       </w:r>
     </w:p>
     <w:p>
@@ -477,11 +641,298 @@
       <w:r>
         <w:t>. Luego creamos otro código donde haríamos las distintas funcionalidades del inciso 1</w:t>
       </w:r>
-      <w:bookmarkStart w:id="1" w:name="_GoBack"/>
-      <w:bookmarkEnd w:id="1"/>
+      <w:r>
+        <w:t>, donde primero calcula las transformadas de Fourier de ambas imágenes y luego multiplica la transformada del primero por el conjugado del segundo para conseguir el espectro cruzado. Finalmente</w:t>
+      </w:r>
+      <w:r>
+        <w:t xml:space="preserve"> hacemos el espectro cruzado normalizado dividiendo el espectro cruzado por su magnitud</w:t>
+      </w:r>
+      <w:r>
+        <w:t>.</w:t>
+      </w:r>
+    </w:p>
+    <w:p>
+      <w:r>
+        <w:t xml:space="preserve">Ya con el espectro cruzado normalizado se calcula la correlación de las imágenes utilizando una función de </w:t>
+      </w:r>
+      <w:proofErr w:type="spellStart"/>
+      <w:r>
+        <w:t>numpy</w:t>
+      </w:r>
+      <w:proofErr w:type="spellEnd"/>
+      <w:r>
+        <w:t xml:space="preserve"> para las </w:t>
+      </w:r>
+      <w:proofErr w:type="spellStart"/>
+      <w:r>
+        <w:t>fft</w:t>
+      </w:r>
+      <w:proofErr w:type="spellEnd"/>
+      <w:r>
+        <w:t xml:space="preserve"> que te da la correlación, dándonos como resultado un vector desplazamiento igual a (40, 10), o sea, está desplazado 40 la x y 10 la y en la imagen 2 con respecto a la imagen 1.</w:t>
+      </w:r>
+    </w:p>
+    <w:p>
+      <w:r>
+        <w:t>Para validar creamos un código que te genere una imagen con el desplazamiento que vos le pongas y al ponerle el desplazamiento 40 en la x y 10 en la y para la imagen 1, obtuvimos la imagen 2.</w:t>
+      </w:r>
+    </w:p>
+    <w:p>
+      <w:r>
+        <w:t xml:space="preserve">Para explicar por qué la magnitud del espectro de Fourier es invariante a las traslaciones espaciales hay que </w:t>
+      </w:r>
+      <w:r>
+        <w:t>plantear la representación polar del espectro para poder entenderlo, siendo esta:</w:t>
+      </w:r>
+    </w:p>
+    <w:p>
+      <m:oMathPara>
+        <m:oMath>
+          <m:r>
+            <w:rPr>
+              <w:rFonts w:ascii="Cambria Math" w:hAnsi="Cambria Math"/>
+            </w:rPr>
+            <m:t>F</m:t>
+          </m:r>
+          <m:d>
+            <m:dPr>
+              <m:ctrlPr>
+                <w:rPr>
+                  <w:rFonts w:ascii="Cambria Math" w:hAnsi="Cambria Math"/>
+                  <w:i/>
+                </w:rPr>
+              </m:ctrlPr>
+            </m:dPr>
+            <m:e>
+              <m:r>
+                <w:rPr>
+                  <w:rFonts w:ascii="Cambria Math" w:hAnsi="Cambria Math"/>
+                </w:rPr>
+                <m:t>u,v</m:t>
+              </m:r>
+            </m:e>
+          </m:d>
+          <m:r>
+            <w:rPr>
+              <w:rFonts w:ascii="Cambria Math" w:hAnsi="Cambria Math"/>
+            </w:rPr>
+            <m:t>=</m:t>
+          </m:r>
+          <m:d>
+            <m:dPr>
+              <m:begChr m:val="|"/>
+              <m:endChr m:val="|"/>
+              <m:ctrlPr>
+                <w:rPr>
+                  <w:rFonts w:ascii="Cambria Math" w:hAnsi="Cambria Math"/>
+                  <w:i/>
+                </w:rPr>
+              </m:ctrlPr>
+            </m:dPr>
+            <m:e>
+              <m:r>
+                <w:rPr>
+                  <w:rFonts w:ascii="Cambria Math" w:hAnsi="Cambria Math"/>
+                </w:rPr>
+                <m:t>F</m:t>
+              </m:r>
+            </m:e>
+          </m:d>
+          <m:r>
+            <w:rPr>
+              <w:rFonts w:ascii="Cambria Math" w:hAnsi="Cambria Math"/>
+            </w:rPr>
+            <m:t>*</m:t>
+          </m:r>
+          <m:sSup>
+            <m:sSupPr>
+              <m:ctrlPr>
+                <w:rPr>
+                  <w:rFonts w:ascii="Cambria Math" w:hAnsi="Cambria Math"/>
+                  <w:i/>
+                </w:rPr>
+              </m:ctrlPr>
+            </m:sSupPr>
+            <m:e>
+              <m:r>
+                <w:rPr>
+                  <w:rFonts w:ascii="Cambria Math" w:hAnsi="Cambria Math"/>
+                </w:rPr>
+                <m:t>e</m:t>
+              </m:r>
+            </m:e>
+            <m:sup>
+              <m:r>
+                <w:rPr>
+                  <w:rFonts w:ascii="Cambria Math" w:hAnsi="Cambria Math"/>
+                </w:rPr>
+                <m:t>j*φ</m:t>
+              </m:r>
+            </m:sup>
+          </m:sSup>
+        </m:oMath>
+      </m:oMathPara>
+    </w:p>
+    <w:p>
+      <w:r>
+        <w:t xml:space="preserve">Entendiendo que </w:t>
+      </w:r>
+      <m:oMath>
+        <m:d>
+          <m:dPr>
+            <m:begChr m:val="|"/>
+            <m:endChr m:val="|"/>
+            <m:ctrlPr>
+              <w:rPr>
+                <w:rFonts w:ascii="Cambria Math" w:hAnsi="Cambria Math"/>
+                <w:i/>
+              </w:rPr>
+            </m:ctrlPr>
+          </m:dPr>
+          <m:e>
+            <m:r>
+              <w:rPr>
+                <w:rFonts w:ascii="Cambria Math" w:hAnsi="Cambria Math"/>
+              </w:rPr>
+              <m:t>F</m:t>
+            </m:r>
+          </m:e>
+        </m:d>
+      </m:oMath>
+      <w:r>
+        <w:rPr>
+          <w:rFonts w:eastAsiaTheme="minorEastAsia"/>
+        </w:rPr>
+        <w:t xml:space="preserve"> es la magnitud de la función, podemos observar que si se traslada, lo que conseguimos es que se mueva el </w:t>
+      </w:r>
+      <m:oMath>
+        <m:r>
+          <w:rPr>
+            <w:rFonts w:ascii="Cambria Math" w:hAnsi="Cambria Math"/>
+          </w:rPr>
+          <m:t>φ</m:t>
+        </m:r>
+      </m:oMath>
+      <w:r>
+        <w:rPr>
+          <w:rFonts w:eastAsiaTheme="minorEastAsia"/>
+        </w:rPr>
+        <w:t>, o sea, la fase, pero su magnitud sigue invariante.</w:t>
+      </w:r>
     </w:p>
     <w:p/>
-    <w:p/>
+    <w:p>
+      <w:r>
+        <w:lastRenderedPageBreak/>
+        <w:t>Luego creamos un programa que a fuerza bruta va comparando distintos desplazamientos pixel a pixel hasta que encuentra uno que hace coincidir ambas imágenes, que también da un resultado de desplazamiento de 40 y 10 para x e y respectivamente. Este acercamiento es mucho más lento porque tiene que hacer prueba y error hasta que encuentra un match de imágenes y tiene un costo computacional considerablemente más grande.</w:t>
+      </w:r>
+    </w:p>
+    <w:p>
+      <w:pPr>
+        <w:pStyle w:val="Ttulo1"/>
+      </w:pPr>
+      <w:bookmarkStart w:id="2" w:name="_Toc230691752"/>
+      <w:r>
+        <w:t>Inciso 2:</w:t>
+      </w:r>
+      <w:bookmarkEnd w:id="2"/>
+    </w:p>
+    <w:p>
+      <w:pPr>
+        <w:rPr>
+          <w:b/>
+          <w:u w:val="single"/>
+        </w:rPr>
+      </w:pPr>
+      <w:r>
+        <w:rPr>
+          <w:b/>
+        </w:rPr>
+        <w:t>Registro de Rotación: Considere ahora las imágenes f3 y f4, siendo esta última una versión rotada de f3. Dado que una rotación en el dominio espacial se traduce en una rotación idéntica en el dominio de la frecuencia, implemente un mapeo de las magnitudes de los espectros a coordenadas polares (</w:t>
+      </w:r>
+      <w:r>
+        <w:rPr>
+          <w:rFonts w:hint="eastAsia"/>
+          <w:b/>
+          <w:sz w:val="22"/>
+        </w:rPr>
+        <w:t>ρ</w:t>
+      </w:r>
+      <w:r>
+        <w:rPr>
+          <w:b/>
+        </w:rPr>
+        <w:t xml:space="preserve">, </w:t>
+      </w:r>
+      <w:r>
+        <w:rPr>
+          <w:rFonts w:hint="eastAsia"/>
+          <w:b/>
+          <w:sz w:val="22"/>
+        </w:rPr>
+        <w:t>θ</w:t>
+      </w:r>
+      <w:r>
+        <w:rPr>
+          <w:b/>
+        </w:rPr>
+        <w:t xml:space="preserve">). Determine el ángulo de rotación encontrando el desplazamiento lineal en el eje </w:t>
+      </w:r>
+      <w:r>
+        <w:rPr>
+          <w:rFonts w:hint="eastAsia"/>
+          <w:b/>
+          <w:sz w:val="22"/>
+        </w:rPr>
+        <w:t>θ</w:t>
+      </w:r>
+      <w:r>
+        <w:rPr>
+          <w:b/>
+        </w:rPr>
+        <w:t>.</w:t>
+      </w:r>
+    </w:p>
+    <w:p>
+      <w:r>
+        <w:t xml:space="preserve">Para resolver este ejercicio, creamos un programa que primero pasa las transformadas de Fourier de coordenadas cartesianas a coordenadas polares, dando como resultado una matriz donde el eje horizontal es θ indicando el ángulo y el vertical </w:t>
+      </w:r>
+      <w:r>
+        <w:rPr>
+          <w:rFonts w:hint="eastAsia"/>
+          <w:sz w:val="22"/>
+        </w:rPr>
+        <w:t>ρ</w:t>
+      </w:r>
+      <w:r>
+        <w:rPr>
+          <w:rFonts w:hint="eastAsia"/>
+          <w:sz w:val="22"/>
+        </w:rPr>
+        <w:t xml:space="preserve"> </w:t>
+      </w:r>
+      <w:r>
+        <w:t xml:space="preserve">que indica el radio de frecuencia. Una vez tiene esos datos los promedia y luego compara distintos </w:t>
+      </w:r>
+      <w:r>
+        <w:t>ángulos hasta que encuentra el ángulo de rotación, que nos dio una rotación de 35°.</w:t>
+      </w:r>
+    </w:p>
+    <w:p>
+      <w:pPr>
+        <w:rPr>
+          <w:u w:val="single"/>
+        </w:rPr>
+      </w:pPr>
+      <w:r>
+        <w:t>Nuevamente, como en el problema anterior, para corroborar creamos un código que recibe una imagen y un ángulo y la rota dicho ángulo. Aplicando este código con la imagen 3 y un ángulo de 35°</w:t>
+      </w:r>
+      <w:bookmarkStart w:id="3" w:name="_GoBack"/>
+      <w:bookmarkEnd w:id="3"/>
+      <w:r>
+        <w:t>, conseguimos una imagen idéntica a la 4.</w:t>
+      </w:r>
+    </w:p>
     <w:p/>
     <w:sectPr>
       <w:footerReference w:type="default" r:id="rId9"/>
@@ -587,7 +1038,7 @@
         <w:szCs w:val="24"/>
         <w:lang w:val="es-MX"/>
       </w:rPr>
-      <w:t>2</w:t>
+      <w:t>3</w:t>
     </w:r>
     <w:r>
       <w:rPr>
@@ -638,7 +1089,7 @@
         <w:szCs w:val="24"/>
         <w:lang w:val="es-MX"/>
       </w:rPr>
-      <w:t>3</w:t>
+      <w:t>4</w:t>
     </w:r>
     <w:r>
       <w:rPr>
@@ -4112,6 +4563,31 @@
       <w:u w:val="single"/>
     </w:rPr>
   </w:style>
+  <w:style w:type="character" w:customStyle="1" w:styleId="mord">
+    <w:name w:val="mord"/>
+    <w:basedOn w:val="Fuentedeprrafopredeter"/>
+    <w:rsid w:val="005E2555"/>
+  </w:style>
+  <w:style w:type="character" w:customStyle="1" w:styleId="mopen">
+    <w:name w:val="mopen"/>
+    <w:basedOn w:val="Fuentedeprrafopredeter"/>
+    <w:rsid w:val="005E2555"/>
+  </w:style>
+  <w:style w:type="character" w:customStyle="1" w:styleId="mpunct">
+    <w:name w:val="mpunct"/>
+    <w:basedOn w:val="Fuentedeprrafopredeter"/>
+    <w:rsid w:val="005E2555"/>
+  </w:style>
+  <w:style w:type="character" w:customStyle="1" w:styleId="mclose">
+    <w:name w:val="mclose"/>
+    <w:basedOn w:val="Fuentedeprrafopredeter"/>
+    <w:rsid w:val="005E2555"/>
+  </w:style>
+  <w:style w:type="character" w:customStyle="1" w:styleId="mrel">
+    <w:name w:val="mrel"/>
+    <w:basedOn w:val="Fuentedeprrafopredeter"/>
+    <w:rsid w:val="005E2555"/>
+  </w:style>
 </w:styles>
 </file>
 
@@ -4415,7 +4891,7 @@
 </file>
 
 <file path=customXml/itemProps1.xml><?xml version="1.0" encoding="utf-8"?>
-<ds:datastoreItem xmlns:ds="http://schemas.openxmlformats.org/officeDocument/2006/customXml" ds:itemID="{E36221D3-DEC1-423F-8B23-A307277C922A}">
+<ds:datastoreItem xmlns:ds="http://schemas.openxmlformats.org/officeDocument/2006/customXml" ds:itemID="{38C046F4-6A32-42D5-A5A9-414E2172AF35}">
   <ds:schemaRefs>
     <ds:schemaRef ds:uri="http://schemas.openxmlformats.org/officeDocument/2006/bibliography"/>
   </ds:schemaRefs>

</xml_diff>

<commit_message>
Agregado del inciso 3 entero.
</commit_message>
<xml_diff>
--- a/TP2/Entregable.docx
+++ b/TP2/Entregable.docx
@@ -9,7 +9,7 @@
       <w:r>
         <w:rPr>
           <w:noProof/>
-          <w:lang w:eastAsia="es-AR"/>
+          <w:lang w:val="es-ES" w:eastAsia="es-ES"/>
         </w:rPr>
         <w:drawing>
           <wp:inline distT="0" distB="0" distL="0" distR="0" wp14:anchorId="2601D6A7" wp14:editId="3234A761">
@@ -503,21 +503,7 @@
                 <w:rStyle w:val="Hipervnculo"/>
                 <w:noProof/>
               </w:rPr>
-              <w:t xml:space="preserve">Inciso </w:t>
-            </w:r>
-            <w:r>
-              <w:rPr>
-                <w:rStyle w:val="Hipervnculo"/>
-                <w:noProof/>
-              </w:rPr>
-              <w:t>2</w:t>
-            </w:r>
-            <w:r>
-              <w:rPr>
-                <w:rStyle w:val="Hipervnculo"/>
-                <w:noProof/>
-              </w:rPr>
-              <w:t>:</w:t>
+              <w:t>Inciso 2:</w:t>
             </w:r>
             <w:r>
               <w:rPr>
@@ -912,10 +898,22 @@
         <w:t xml:space="preserve"> </w:t>
       </w:r>
       <w:r>
-        <w:t xml:space="preserve">que indica el radio de frecuencia. Una vez tiene esos datos los promedia y luego compara distintos </w:t>
-      </w:r>
-      <w:r>
-        <w:t>ángulos hasta que encuentra el ángulo de rotación, que nos dio una rotación de 35°.</w:t>
+        <w:t>que indica el radio de frecuencia. Una vez tiene esos datos los promedia</w:t>
+      </w:r>
+      <w:r>
+        <w:t>,</w:t>
+      </w:r>
+      <w:r>
+        <w:t xml:space="preserve"> y luego compara distintos </w:t>
+      </w:r>
+      <w:r>
+        <w:t>ángulos hasta que encuentra el ángulo de rotación</w:t>
+      </w:r>
+      <w:r>
+        <w:t xml:space="preserve"> de la imagen 4 comparada con la 3</w:t>
+      </w:r>
+      <w:r>
+        <w:t>, que nos dio una rotación de 35°.</w:t>
       </w:r>
     </w:p>
     <w:p>
@@ -925,15 +923,220 @@
         </w:rPr>
       </w:pPr>
       <w:r>
-        <w:t>Nuevamente, como en el problema anterior, para corroborar creamos un código que recibe una imagen y un ángulo y la rota dicho ángulo. Aplicando este código con la imagen 3 y un ángulo de 35°</w:t>
+        <w:t>Nuevamente, como en el problema anterior, para corroborar creamos un código que recibe una imagen y un ángulo y la rota dicho ángulo. Aplicando este código con la imagen 3 y un ángulo de 35°, conseguimos una imagen idéntica a la 4.</w:t>
+      </w:r>
+    </w:p>
+    <w:p>
+      <w:pPr>
+        <w:pStyle w:val="Ttulo1"/>
+      </w:pPr>
+      <w:r>
+        <w:t>Inciso 3:</w:t>
+      </w:r>
+    </w:p>
+    <w:p>
+      <w:pPr>
+        <w:rPr>
+          <w:b/>
+        </w:rPr>
+      </w:pPr>
+      <w:r>
+        <w:rPr>
+          <w:b/>
+        </w:rPr>
+        <w:t>Cuando una imagen sufre un c</w:t>
+      </w:r>
+      <w:r>
+        <w:rPr>
+          <w:b/>
+        </w:rPr>
+        <w:t xml:space="preserve">ambio de escala, su espectro de </w:t>
+      </w:r>
+      <w:r>
+        <w:rPr>
+          <w:b/>
+        </w:rPr>
+        <w:t xml:space="preserve">Fourier se escala de forma inversa. Investigue </w:t>
+      </w:r>
+      <w:r>
+        <w:rPr>
+          <w:b/>
+        </w:rPr>
+        <w:t>cómo</w:t>
+      </w:r>
+      <w:r>
+        <w:rPr>
+          <w:b/>
+        </w:rPr>
+        <w:t xml:space="preserve"> el uso de coordenadas Log</w:t>
+      </w:r>
+      <w:r>
+        <w:rPr>
+          <w:b/>
+        </w:rPr>
+        <w:t xml:space="preserve">-Polares transforma los cambios </w:t>
+      </w:r>
+      <w:r>
+        <w:rPr>
+          <w:b/>
+        </w:rPr>
+        <w:t>de escala en desplazamientos lineales. Implemente un algoritmo que recuper</w:t>
+      </w:r>
+      <w:r>
+        <w:rPr>
+          <w:b/>
+        </w:rPr>
+        <w:t xml:space="preserve">e el factor de escala entre las </w:t>
+      </w:r>
+      <w:r>
+        <w:rPr>
+          <w:b/>
+        </w:rPr>
+        <w:t>imágenes</w:t>
+      </w:r>
+      <w:r>
+        <w:rPr>
+          <w:b/>
+        </w:rPr>
+        <w:t xml:space="preserve"> f5 y f1, utilizando la </w:t>
+      </w:r>
+      <w:r>
+        <w:rPr>
+          <w:b/>
+        </w:rPr>
+        <w:t>correlación</w:t>
+      </w:r>
+      <w:r>
+        <w:rPr>
+          <w:b/>
+        </w:rPr>
+        <w:t xml:space="preserve"> de fase sobre el mapa log-polar.</w:t>
+      </w:r>
+    </w:p>
+    <w:p>
+      <w:r>
+        <w:t xml:space="preserve">Para entender cómo transforma los cambios de escala en desplazamientos lineales, primero hay que entender que en las coordenadas log-polares, </w:t>
+      </w:r>
+      <w:r>
+        <w:rPr>
+          <w:rFonts w:hint="eastAsia"/>
+          <w:sz w:val="22"/>
+        </w:rPr>
+        <w:t>ρ</w:t>
+      </w:r>
+      <w:r>
+        <w:t xml:space="preserve"> = </w:t>
+      </w:r>
+      <w:proofErr w:type="spellStart"/>
+      <w:r>
+        <w:t>ln</w:t>
+      </w:r>
+      <w:proofErr w:type="spellEnd"/>
+      <w:r>
+        <w:t xml:space="preserve">(r), por ende, si se hace un cambio en la escala de k*r, siendo k una constante, al pasarlo a coordenadas polares quedaría </w:t>
+      </w:r>
+      <w:r>
+        <w:rPr>
+          <w:rFonts w:hint="eastAsia"/>
+          <w:sz w:val="22"/>
+        </w:rPr>
+        <w:t>ρ</w:t>
+      </w:r>
+      <w:r>
+        <w:t xml:space="preserve"> = </w:t>
+      </w:r>
+      <w:proofErr w:type="spellStart"/>
+      <w:r>
+        <w:t>ln</w:t>
+      </w:r>
+      <w:proofErr w:type="spellEnd"/>
+      <w:r>
+        <w:t>(</w:t>
+      </w:r>
+      <w:r>
+        <w:t>k*</w:t>
+      </w:r>
+      <w:r>
+        <w:t>r)</w:t>
+      </w:r>
+      <w:r>
+        <w:t>,</w:t>
+      </w:r>
+      <w:r>
+        <w:t xml:space="preserve"> y por propiedades de los logaritmos tenemos que </w:t>
+      </w:r>
+      <w:r>
+        <w:rPr>
+          <w:rFonts w:hint="eastAsia"/>
+          <w:sz w:val="22"/>
+        </w:rPr>
+        <w:t>ρ</w:t>
+      </w:r>
+      <w:r>
+        <w:t xml:space="preserve"> = </w:t>
+      </w:r>
+      <w:proofErr w:type="spellStart"/>
+      <w:r>
+        <w:t>ln</w:t>
+      </w:r>
+      <w:proofErr w:type="spellEnd"/>
+      <w:r>
+        <w:t>(k)</w:t>
+      </w:r>
+      <w:r>
+        <w:t>+</w:t>
+      </w:r>
+      <w:proofErr w:type="spellStart"/>
+      <w:r>
+        <w:t>ln</w:t>
+      </w:r>
+      <w:proofErr w:type="spellEnd"/>
+      <w:r>
+        <w:t>(r)</w:t>
+      </w:r>
+      <w:r>
+        <w:t xml:space="preserve"> siendo </w:t>
+      </w:r>
+      <w:proofErr w:type="spellStart"/>
+      <w:r>
+        <w:t>ln</w:t>
+      </w:r>
+      <w:proofErr w:type="spellEnd"/>
+      <w:r>
+        <w:t>(k) otra constante y dándonos así un desplazamiento lineal.</w:t>
+      </w:r>
+    </w:p>
+    <w:p>
+      <w:r>
+        <w:lastRenderedPageBreak/>
+        <w:t xml:space="preserve">Luego implementamos un algoritmo que utiliza la </w:t>
+      </w:r>
+      <w:r>
+        <w:t>correlación</w:t>
+      </w:r>
+      <w:r>
+        <w:t xml:space="preserve"> de fase sobre el mapa log-polar para calcular el factor de escala entre las imágenes, dándonos como resultado</w:t>
+      </w:r>
+      <w:r>
+        <w:t xml:space="preserve"> un desplazamiento de 1,2935 aproximadamente.</w:t>
+      </w:r>
+    </w:p>
+    <w:p>
+      <w:r>
+        <w:t>Finalmente creamos un nuevo programa para validar, al que le pasas una imagen y un factor k como argumento y te genera una imagen a la que</w:t>
+      </w:r>
+      <w:r>
+        <w:t xml:space="preserve"> le aplica el desplazamiento enviado como argumento haciendo para las coordenadas polares r*k, y le mandamos como argumento la imagen 1 y una k=</w:t>
+      </w:r>
+      <w:r>
+        <w:t>1,2935</w:t>
+      </w:r>
+      <w:r>
+        <w:t>, dándonos una imagen idéntica a la 5.</w:t>
       </w:r>
       <w:bookmarkStart w:id="3" w:name="_GoBack"/>
       <w:bookmarkEnd w:id="3"/>
-      <w:r>
-        <w:t>, conseguimos una imagen idéntica a la 4.</w:t>
-      </w:r>
     </w:p>
-    <w:p/>
     <w:sectPr>
       <w:footerReference w:type="default" r:id="rId9"/>
       <w:pgSz w:w="11906" w:h="16838"/>
@@ -1038,7 +1241,7 @@
         <w:szCs w:val="24"/>
         <w:lang w:val="es-MX"/>
       </w:rPr>
-      <w:t>3</w:t>
+      <w:t>4</w:t>
     </w:r>
     <w:r>
       <w:rPr>
@@ -1089,7 +1292,7 @@
         <w:szCs w:val="24"/>
         <w:lang w:val="es-MX"/>
       </w:rPr>
-      <w:t>4</w:t>
+      <w:t>5</w:t>
     </w:r>
     <w:r>
       <w:rPr>
@@ -4891,7 +5094,7 @@
 </file>
 
 <file path=customXml/itemProps1.xml><?xml version="1.0" encoding="utf-8"?>
-<ds:datastoreItem xmlns:ds="http://schemas.openxmlformats.org/officeDocument/2006/customXml" ds:itemID="{38C046F4-6A32-42D5-A5A9-414E2172AF35}">
+<ds:datastoreItem xmlns:ds="http://schemas.openxmlformats.org/officeDocument/2006/customXml" ds:itemID="{7CAFDE94-0670-4DE4-9A7E-97A15E7356FF}">
   <ds:schemaRefs>
     <ds:schemaRef ds:uri="http://schemas.openxmlformats.org/officeDocument/2006/bibliography"/>
   </ds:schemaRefs>

</xml_diff>

<commit_message>
Correcciones menores del informe y agregado de introducción al mismo
</commit_message>
<xml_diff>
--- a/TP2/Entregable.docx
+++ b/TP2/Entregable.docx
@@ -1,6 +1,6 @@
 
 <file path=word/document.xml><?xml version="1.0" encoding="utf-8"?>
-<w:document xmlns:wpc="http://schemas.microsoft.com/office/word/2010/wordprocessingCanvas" xmlns:cx="http://schemas.microsoft.com/office/drawing/2014/chartex" xmlns:cx1="http://schemas.microsoft.com/office/drawing/2015/9/8/chartex" xmlns:cx2="http://schemas.microsoft.com/office/drawing/2015/10/21/chartex" xmlns:cx3="http://schemas.microsoft.com/office/drawing/2016/5/9/chartex" xmlns:cx4="http://schemas.microsoft.com/office/drawing/2016/5/10/chartex" xmlns:cx5="http://schemas.microsoft.com/office/drawing/2016/5/11/chartex" xmlns:cx6="http://schemas.microsoft.com/office/drawing/2016/5/12/chartex" xmlns:cx7="http://schemas.microsoft.com/office/drawing/2016/5/13/chartex" xmlns:cx8="http://schemas.microsoft.com/office/drawing/2016/5/14/chartex" xmlns:mc="http://schemas.openxmlformats.org/markup-compatibility/2006" xmlns:aink="http://schemas.microsoft.com/office/drawing/2016/ink" xmlns:am3d="http://schemas.microsoft.com/office/drawing/2017/model3d" xmlns:o="urn:schemas-microsoft-com:office:office" xmlns:oel="http://schemas.microsoft.com/office/2019/extlst" xmlns:r="http://schemas.openxmlformats.org/officeDocument/2006/relationships" xmlns:m="http://schemas.openxmlformats.org/officeDocument/2006/math" xmlns:v="urn:schemas-microsoft-com:vml" xmlns:wp14="http://schemas.microsoft.com/office/word/2010/wordprocessingDrawing" xmlns:wp="http://schemas.openxmlformats.org/drawingml/2006/wordprocessingDrawing" xmlns:w10="urn:schemas-microsoft-com:office:word" xmlns:w="http://schemas.openxmlformats.org/wordprocessingml/2006/main" xmlns:w14="http://schemas.microsoft.com/office/word/2010/wordml" xmlns:w15="http://schemas.microsoft.com/office/word/2012/wordml" xmlns:w16cex="http://schemas.microsoft.com/office/word/2018/wordml/cex" xmlns:w16cid="http://schemas.microsoft.com/office/word/2016/wordml/cid" xmlns:w16="http://schemas.microsoft.com/office/word/2018/wordml" xmlns:w16du="http://schemas.microsoft.com/office/word/2023/wordml/word16du" xmlns:w16sdtdh="http://schemas.microsoft.com/office/word/2020/wordml/sdtdatahash" xmlns:w16sdtfl="http://schemas.microsoft.com/office/word/2024/wordml/sdtformatlock" xmlns:w16se="http://schemas.microsoft.com/office/word/2015/wordml/symex" xmlns:wpg="http://schemas.microsoft.com/office/word/2010/wordprocessingGroup" xmlns:wpi="http://schemas.microsoft.com/office/word/2010/wordprocessingInk" xmlns:wne="http://schemas.microsoft.com/office/word/2006/wordml" xmlns:wps="http://schemas.microsoft.com/office/word/2010/wordprocessingShape" mc:Ignorable="w14 w15 w16se w16cid w16 w16cex w16sdtdh w16sdtfl w16du wp14">
+<w:document xmlns:wpc="http://schemas.microsoft.com/office/word/2010/wordprocessingCanvas" xmlns:cx="http://schemas.microsoft.com/office/drawing/2014/chartex" xmlns:mc="http://schemas.openxmlformats.org/markup-compatibility/2006" xmlns:o="urn:schemas-microsoft-com:office:office" xmlns:r="http://schemas.openxmlformats.org/officeDocument/2006/relationships" xmlns:m="http://schemas.openxmlformats.org/officeDocument/2006/math" xmlns:v="urn:schemas-microsoft-com:vml" xmlns:wp14="http://schemas.microsoft.com/office/word/2010/wordprocessingDrawing" xmlns:wp="http://schemas.openxmlformats.org/drawingml/2006/wordprocessingDrawing" xmlns:w10="urn:schemas-microsoft-com:office:word" xmlns:w="http://schemas.openxmlformats.org/wordprocessingml/2006/main" xmlns:w14="http://schemas.microsoft.com/office/word/2010/wordml" xmlns:w15="http://schemas.microsoft.com/office/word/2012/wordml" xmlns:w16se="http://schemas.microsoft.com/office/word/2015/wordml/symex" xmlns:wpg="http://schemas.microsoft.com/office/word/2010/wordprocessingGroup" xmlns:wpi="http://schemas.microsoft.com/office/word/2010/wordprocessingInk" xmlns:wne="http://schemas.microsoft.com/office/word/2006/wordml" xmlns:wps="http://schemas.microsoft.com/office/word/2010/wordprocessingShape" mc:Ignorable="w14 w15 w16se wp14">
   <w:body>
     <w:p>
       <w:pPr>
@@ -9,7 +9,7 @@
       <w:r>
         <w:rPr>
           <w:noProof/>
-          <w:lang w:val="es-ES" w:eastAsia="es-ES"/>
+          <w:lang w:eastAsia="es-AR"/>
         </w:rPr>
         <w:drawing>
           <wp:inline distT="0" distB="0" distL="0" distR="0" wp14:anchorId="2601D6A7" wp14:editId="3234A761">
@@ -479,7 +479,7 @@
                 <w:noProof/>
                 <w:webHidden/>
               </w:rPr>
-              <w:t>4</w:t>
+              <w:t>3</w:t>
             </w:r>
             <w:r>
               <w:rPr>
@@ -553,7 +553,7 @@
                 <w:noProof/>
                 <w:webHidden/>
               </w:rPr>
-              <w:t>6</w:t>
+              <w:t>4</w:t>
             </w:r>
             <w:r>
               <w:rPr>
@@ -627,7 +627,7 @@
                 <w:noProof/>
                 <w:webHidden/>
               </w:rPr>
-              <w:t>7</w:t>
+              <w:t>4</w:t>
             </w:r>
             <w:r>
               <w:rPr>
@@ -701,7 +701,7 @@
                 <w:noProof/>
                 <w:webHidden/>
               </w:rPr>
-              <w:t>8</w:t>
+              <w:t>5</w:t>
             </w:r>
             <w:r>
               <w:rPr>
@@ -741,41 +741,99 @@
       </w:r>
       <w:bookmarkEnd w:id="0"/>
     </w:p>
-    <w:p/>
-    <w:p/>
-    <w:p/>
-    <w:p/>
-    <w:p/>
-    <w:p/>
-    <w:p/>
-    <w:p/>
-    <w:p/>
-    <w:p/>
-    <w:p/>
-    <w:p/>
-    <w:p/>
-    <w:p/>
-    <w:p/>
-    <w:p/>
-    <w:p/>
-    <w:p/>
-    <w:p/>
-    <w:p/>
-    <w:p/>
-    <w:p/>
-    <w:p/>
-    <w:p/>
-    <w:p/>
     <w:p>
+      <w:r>
+        <w:t xml:space="preserve">El objetivo de este trabajo </w:t>
+      </w:r>
+      <w:r>
+        <w:t>practico</w:t>
+      </w:r>
+      <w:r>
+        <w:t xml:space="preserve"> es implementar algoritmos de registro de </w:t>
+      </w:r>
+      <w:r>
+        <w:t xml:space="preserve">imágenes basados en propiedades </w:t>
+      </w:r>
+      <w:r>
+        <w:t>de la Transformada de Fourier. A diferencia de los</w:t>
+      </w:r>
+      <w:r>
+        <w:t xml:space="preserve"> métodos</w:t>
+      </w:r>
+      <w:r>
+        <w:t xml:space="preserve"> espaciales, la </w:t>
+      </w:r>
+      <w:r>
+        <w:t>correlación de fase permite determinar parámetros</w:t>
+      </w:r>
+      <w:r>
+        <w:t xml:space="preserve"> de </w:t>
+      </w:r>
+      <w:r>
+        <w:t>traslación</w:t>
+      </w:r>
+      <w:r>
+        <w:t xml:space="preserve">, </w:t>
+      </w:r>
+      <w:r>
+        <w:t>rotación</w:t>
+      </w:r>
+      <w:r>
+        <w:t xml:space="preserve"> y escalamiento de forma robusta y eficiente.</w:t>
+      </w:r>
+    </w:p>
+    <w:p>
+      <w:r>
+        <w:t xml:space="preserve">Para realizarlo utilizamos paquetes de Python recomendados por la cátedra </w:t>
+      </w:r>
+      <w:r>
+        <w:t>y,</w:t>
+      </w:r>
+      <w:r>
+        <w:t xml:space="preserve"> además, creamos </w:t>
+      </w:r>
+      <w:r>
+        <w:t xml:space="preserve">un repositorio de </w:t>
+      </w:r>
+      <w:proofErr w:type="spellStart"/>
+      <w:r>
+        <w:t>G</w:t>
+      </w:r>
+      <w:bookmarkStart w:id="1" w:name="_GoBack"/>
+      <w:bookmarkEnd w:id="1"/>
+      <w:r>
+        <w:t>ithub</w:t>
+      </w:r>
+      <w:proofErr w:type="spellEnd"/>
+      <w:r>
+        <w:t xml:space="preserve"> donde iremos subiendo los trabajos prácticos durante el año</w:t>
+      </w:r>
+      <w:r>
+        <w:t>, el cual está en el siguiente link:</w:t>
+      </w:r>
+    </w:p>
+    <w:p>
+      <w:hyperlink r:id="rId9" w:history="1">
+        <w:r>
+          <w:rPr>
+            <w:rStyle w:val="Hipervnculo"/>
+          </w:rPr>
+          <w:t>https://github.com/pabloDLQ/Analisis-numerico-2026</w:t>
+        </w:r>
+      </w:hyperlink>
+      <w:r>
+        <w:t xml:space="preserve"> </w:t>
+      </w:r>
+    </w:p>
+    <w:p>
       <w:pPr>
         <w:pStyle w:val="Ttulo1"/>
       </w:pPr>
-      <w:bookmarkStart w:id="1" w:name="_Toc231218693"/>
-      <w:r>
-        <w:lastRenderedPageBreak/>
+      <w:bookmarkStart w:id="2" w:name="_Toc231218693"/>
+      <w:r>
         <w:t>Inciso 1:</w:t>
       </w:r>
-      <w:bookmarkEnd w:id="1"/>
+      <w:bookmarkEnd w:id="2"/>
     </w:p>
     <w:p>
       <w:pPr>
@@ -859,6 +917,7 @@
             <w:rPr>
               <w:rFonts w:ascii="Cambria Math" w:hAnsi="Cambria Math"/>
             </w:rPr>
+            <w:lastRenderedPageBreak/>
             <m:t>F</m:t>
           </m:r>
           <m:d>
@@ -990,47 +1049,19 @@
     <w:p/>
     <w:p>
       <w:r>
-        <w:t xml:space="preserve">Luego creamos un programa que a fuerza bruta va comparando distintos desplazamientos pixel a pixel hasta que encuentra uno que hace coincidir ambas imágenes, que también da un resultado de desplazamiento de 40 y 10 para x e y respectivamente. Este acercamiento es mucho más lento porque tiene que hacer </w:t>
-      </w:r>
-      <w:r>
-        <w:lastRenderedPageBreak/>
-        <w:t>prueba y error hasta que encuentra un match de imágenes y tiene un costo computacional considerablemente más grande.</w:t>
+        <w:t>Luego creamos un programa que a fuerza bruta va comparando distintos desplazamientos pixel a pixel hasta que encuentra uno que hace coincidir ambas imágenes, que también da un resultado de desplazamiento de 40 y 10 para x e y respectivamente. Este acercamiento es mucho más lento porque tiene que hacer prueba y error hasta que encuentra un match de imágenes y tiene un costo computacional considerablemente más grande.</w:t>
       </w:r>
     </w:p>
     <w:p/>
-    <w:p/>
-    <w:p/>
-    <w:p/>
-    <w:p/>
-    <w:p/>
-    <w:p/>
-    <w:p/>
-    <w:p/>
-    <w:p/>
-    <w:p/>
-    <w:p/>
-    <w:p/>
-    <w:p/>
-    <w:p/>
-    <w:p/>
-    <w:p/>
-    <w:p/>
-    <w:p/>
-    <w:p/>
-    <w:p/>
-    <w:p/>
-    <w:p/>
-    <w:p/>
     <w:p>
       <w:pPr>
         <w:pStyle w:val="Ttulo1"/>
       </w:pPr>
-      <w:bookmarkStart w:id="2" w:name="_Toc231218694"/>
-      <w:r>
-        <w:lastRenderedPageBreak/>
+      <w:bookmarkStart w:id="3" w:name="_Toc231218694"/>
+      <w:r>
         <w:t>Inciso 2:</w:t>
       </w:r>
-      <w:bookmarkEnd w:id="2"/>
+      <w:bookmarkEnd w:id="3"/>
     </w:p>
     <w:p>
       <w:pPr>
@@ -1130,18 +1161,6 @@
         <w:t>Nuevamente, como en el problema anterior, para corroborar creamos un código que recibe una imagen y un ángulo y la rota dicho ángulo. Aplicando este código con la imagen 3 y un ángulo de 35°, conseguimos una imagen idéntica a la 4.</w:t>
       </w:r>
     </w:p>
-    <w:p/>
-    <w:p/>
-    <w:p/>
-    <w:p/>
-    <w:p/>
-    <w:p/>
-    <w:p/>
-    <w:p/>
-    <w:p/>
-    <w:p/>
-    <w:p/>
-    <w:p/>
     <w:p>
       <w:pPr>
         <w:rPr>
@@ -1153,12 +1172,11 @@
       <w:pPr>
         <w:pStyle w:val="Ttulo1"/>
       </w:pPr>
-      <w:bookmarkStart w:id="3" w:name="_Toc231218695"/>
-      <w:r>
-        <w:lastRenderedPageBreak/>
+      <w:bookmarkStart w:id="4" w:name="_Toc231218695"/>
+      <w:r>
         <w:t>Inciso 3:</w:t>
       </w:r>
-      <w:bookmarkEnd w:id="3"/>
+      <w:bookmarkEnd w:id="4"/>
     </w:p>
     <w:p>
       <w:pPr>
@@ -1188,7 +1206,14 @@
         <w:rPr>
           <w:b/>
         </w:rPr>
-        <w:t xml:space="preserve">-Polares transforma los cambios </w:t>
+        <w:t>-</w:t>
+      </w:r>
+      <w:r>
+        <w:rPr>
+          <w:b/>
+        </w:rPr>
+        <w:lastRenderedPageBreak/>
+        <w:t xml:space="preserve">Polares transforma los cambios </w:t>
       </w:r>
       <w:r>
         <w:rPr>
@@ -1313,28 +1338,15 @@
       </w:r>
     </w:p>
     <w:p/>
-    <w:p/>
-    <w:p/>
-    <w:p/>
-    <w:p/>
-    <w:p/>
-    <w:p/>
-    <w:p/>
-    <w:p/>
-    <w:p/>
-    <w:p/>
-    <w:p/>
-    <w:p/>
     <w:p>
       <w:pPr>
         <w:pStyle w:val="Ttulo1"/>
       </w:pPr>
-      <w:bookmarkStart w:id="4" w:name="_Toc231218696"/>
-      <w:r>
-        <w:lastRenderedPageBreak/>
+      <w:bookmarkStart w:id="5" w:name="_Toc231218696"/>
+      <w:r>
         <w:t>Inciso 4:</w:t>
       </w:r>
-      <w:bookmarkEnd w:id="4"/>
+      <w:bookmarkEnd w:id="5"/>
     </w:p>
     <w:p>
       <w:pPr>
@@ -1348,199 +1360,9 @@
           <w:b/>
           <w:bCs/>
         </w:rPr>
-        <w:t xml:space="preserve">Se desea recuperar una imagen objetivo. Se proporcionan dos </w:t>
-      </w:r>
-      <w:r>
-        <w:rPr>
-          <w:b/>
-          <w:bCs/>
-        </w:rPr>
-        <w:t>imágenes</w:t>
-      </w:r>
-      <w:r>
-        <w:rPr>
-          <w:b/>
-          <w:bCs/>
-        </w:rPr>
-        <w:t xml:space="preserve"> en</w:t>
-      </w:r>
-      <w:r>
-        <w:rPr>
-          <w:b/>
-          <w:bCs/>
-        </w:rPr>
-        <w:t xml:space="preserve"> </w:t>
-      </w:r>
-      <w:r>
-        <w:rPr>
-          <w:b/>
-          <w:bCs/>
-        </w:rPr>
-        <w:t>formato TIF, f6 y f7. En el primer caso, la magnitud corresponde a la imagen que se desea recuperar,</w:t>
-      </w:r>
-      <w:r>
-        <w:rPr>
-          <w:b/>
-          <w:bCs/>
-        </w:rPr>
-        <w:t xml:space="preserve"> </w:t>
-      </w:r>
-      <w:r>
-        <w:rPr>
-          <w:b/>
-          <w:bCs/>
-        </w:rPr>
-        <w:t xml:space="preserve">mientras que en el segundo caso la fase corresponde a la imagen que se desea </w:t>
-      </w:r>
-      <w:r>
-        <w:rPr>
-          <w:b/>
-          <w:bCs/>
-        </w:rPr>
-        <w:t>recuperar,</w:t>
-      </w:r>
-      <w:r>
-        <w:rPr>
-          <w:b/>
-          <w:bCs/>
-        </w:rPr>
-        <w:t xml:space="preserve"> pero ha sido alterada</w:t>
-      </w:r>
-      <w:r>
-        <w:rPr>
-          <w:b/>
-          <w:bCs/>
-        </w:rPr>
-        <w:t xml:space="preserve"> </w:t>
-      </w:r>
-      <w:r>
-        <w:rPr>
-          <w:b/>
-          <w:bCs/>
-        </w:rPr>
-        <w:t xml:space="preserve">mediante un factor de </w:t>
-      </w:r>
-      <w:r>
-        <w:rPr>
-          <w:b/>
-          <w:bCs/>
-        </w:rPr>
-        <w:t>compresión</w:t>
-      </w:r>
-      <w:r>
-        <w:rPr>
-          <w:b/>
-          <w:bCs/>
-        </w:rPr>
-        <w:t xml:space="preserve"> de fase k. </w:t>
-      </w:r>
-      <w:r>
-        <w:rPr>
-          <w:b/>
-          <w:bCs/>
-        </w:rPr>
-        <w:t>Diseñe</w:t>
-      </w:r>
-      <w:r>
-        <w:rPr>
-          <w:b/>
-          <w:bCs/>
-        </w:rPr>
-        <w:t xml:space="preserve"> un proceso de </w:t>
-      </w:r>
-      <w:r>
-        <w:rPr>
-          <w:b/>
-          <w:bCs/>
-        </w:rPr>
-        <w:t>búsqueda</w:t>
-      </w:r>
-      <w:r>
-        <w:rPr>
-          <w:b/>
-          <w:bCs/>
-        </w:rPr>
-        <w:t xml:space="preserve"> </w:t>
-      </w:r>
-      <w:r>
-        <w:rPr>
-          <w:b/>
-          <w:bCs/>
-        </w:rPr>
-        <w:t>automática</w:t>
-      </w:r>
-      <w:r>
-        <w:rPr>
-          <w:b/>
-          <w:bCs/>
-        </w:rPr>
-        <w:t xml:space="preserve"> que, mediante una</w:t>
-      </w:r>
-      <w:r>
-        <w:rPr>
-          <w:b/>
-          <w:bCs/>
-        </w:rPr>
-        <w:t xml:space="preserve"> métrica</w:t>
-      </w:r>
-      <w:r>
-        <w:rPr>
-          <w:b/>
-          <w:bCs/>
-        </w:rPr>
-        <w:t xml:space="preserve"> de nitidez (como la magnitud del gradiente espacial), encuentre el factor k </w:t>
-      </w:r>
-      <w:r>
-        <w:rPr>
-          <w:b/>
-          <w:bCs/>
-        </w:rPr>
-        <w:t>óptimo</w:t>
-      </w:r>
-      <w:r>
-        <w:rPr>
-          <w:b/>
-          <w:bCs/>
-        </w:rPr>
-        <w:t xml:space="preserve"> para recuperar la</w:t>
-      </w:r>
-      <w:r>
-        <w:rPr>
-          <w:b/>
-          <w:bCs/>
-        </w:rPr>
-        <w:t xml:space="preserve"> </w:t>
-      </w:r>
-      <w:r>
-        <w:rPr>
-          <w:b/>
-          <w:bCs/>
-        </w:rPr>
-        <w:t xml:space="preserve">imagen objetivo y muestrela. Realice el mismo procedimiento ahora con las </w:t>
-      </w:r>
-      <w:r>
-        <w:rPr>
-          <w:b/>
-          <w:bCs/>
-        </w:rPr>
-        <w:t>imágenes</w:t>
-      </w:r>
-      <w:r>
-        <w:rPr>
-          <w:b/>
-          <w:bCs/>
-        </w:rPr>
-        <w:t xml:space="preserve"> en formato JPG. </w:t>
-      </w:r>
-      <w:r>
-        <w:rPr>
-          <w:b/>
-          <w:bCs/>
-        </w:rPr>
-        <w:t>¿Qué diferencia nota y por qué?</w:t>
+        <w:t>Se desea recuperar una imagen objetivo. Se proporcionan dos imágenes en formato TIF, f6 y f7. En el primer caso, la magnitud corresponde a la imagen que se desea recuperar, mientras que en el segundo caso la fase corresponde a la imagen que se desea recuperar, pero ha sido alterada mediante un factor de compresión de fase k. Diseñe un proceso de búsqueda automática que, mediante una métrica de nitidez (como la magnitud del gradiente espacial), encuentre el factor k óptimo para recuperar la imagen objetivo y muestrela. Realice el mismo procedimiento ahora con las imágenes en formato JPG. ¿Qué diferencia nota y por qué?</w:t>
       </w:r>
     </w:p>
-    <w:p/>
     <w:p>
       <w:r>
         <w:t xml:space="preserve">Para resolver este inciso, diseñamos un proceso de búsqueda automática con el objetivo de encontrar el factor de compresión de fase </w:t>
@@ -1623,19 +1445,7 @@
           <w:rPr>
             <w:rFonts w:ascii="Cambria Math" w:hAnsi="Cambria Math"/>
           </w:rPr>
-          <m:t>Espectro</m:t>
-        </m:r>
-        <m:r>
-          <w:rPr>
-            <w:rFonts w:ascii="Cambria Math" w:hAnsi="Cambria Math"/>
-          </w:rPr>
-          <m:t>=</m:t>
-        </m:r>
-        <m:r>
-          <w:rPr>
-            <w:rFonts w:ascii="Cambria Math" w:hAnsi="Cambria Math"/>
-          </w:rPr>
-          <m:t>Magnitud*</m:t>
+          <m:t>Espectro=Magnitud*</m:t>
         </m:r>
         <m:sSup>
           <m:sSupPr>
@@ -1665,7 +1475,11 @@
         </m:sSup>
       </m:oMath>
       <w:r>
-        <w:t xml:space="preserve">. Luego, aplicamos la transformada inversa para volver al dominio espacial, evaluamos automáticamente distintos valores para </w:t>
+        <w:t xml:space="preserve">. Luego, aplicamos la transformada inversa para volver </w:t>
+      </w:r>
+      <w:r>
+        <w:lastRenderedPageBreak/>
+        <w:t xml:space="preserve">al dominio espacial, evaluamos automáticamente distintos valores para </w:t>
       </w:r>
       <m:oMath>
         <m:r>
@@ -1697,7 +1511,7 @@
     </w:p>
     <w:p/>
     <w:sectPr>
-      <w:footerReference w:type="default" r:id="rId9"/>
+      <w:footerReference w:type="default" r:id="rId10"/>
       <w:pgSz w:w="11906" w:h="16838"/>
       <w:pgMar w:top="1417" w:right="1701" w:bottom="1417" w:left="1701" w:header="708" w:footer="708" w:gutter="0"/>
       <w:cols w:space="708"/>
@@ -1709,7 +1523,7 @@
 </file>
 
 <file path=word/endnotes.xml><?xml version="1.0" encoding="utf-8"?>
-<w:endnotes xmlns:wpc="http://schemas.microsoft.com/office/word/2010/wordprocessingCanvas" xmlns:cx="http://schemas.microsoft.com/office/drawing/2014/chartex" xmlns:cx1="http://schemas.microsoft.com/office/drawing/2015/9/8/chartex" xmlns:cx2="http://schemas.microsoft.com/office/drawing/2015/10/21/chartex" xmlns:cx3="http://schemas.microsoft.com/office/drawing/2016/5/9/chartex" xmlns:cx4="http://schemas.microsoft.com/office/drawing/2016/5/10/chartex" xmlns:cx5="http://schemas.microsoft.com/office/drawing/2016/5/11/chartex" xmlns:cx6="http://schemas.microsoft.com/office/drawing/2016/5/12/chartex" xmlns:cx7="http://schemas.microsoft.com/office/drawing/2016/5/13/chartex" xmlns:cx8="http://schemas.microsoft.com/office/drawing/2016/5/14/chartex" xmlns:mc="http://schemas.openxmlformats.org/markup-compatibility/2006" xmlns:aink="http://schemas.microsoft.com/office/drawing/2016/ink" xmlns:am3d="http://schemas.microsoft.com/office/drawing/2017/model3d" xmlns:o="urn:schemas-microsoft-com:office:office" xmlns:oel="http://schemas.microsoft.com/office/2019/extlst" xmlns:r="http://schemas.openxmlformats.org/officeDocument/2006/relationships" xmlns:m="http://schemas.openxmlformats.org/officeDocument/2006/math" xmlns:v="urn:schemas-microsoft-com:vml" xmlns:wp14="http://schemas.microsoft.com/office/word/2010/wordprocessingDrawing" xmlns:wp="http://schemas.openxmlformats.org/drawingml/2006/wordprocessingDrawing" xmlns:w10="urn:schemas-microsoft-com:office:word" xmlns:w="http://schemas.openxmlformats.org/wordprocessingml/2006/main" xmlns:w14="http://schemas.microsoft.com/office/word/2010/wordml" xmlns:w15="http://schemas.microsoft.com/office/word/2012/wordml" xmlns:w16cex="http://schemas.microsoft.com/office/word/2018/wordml/cex" xmlns:w16cid="http://schemas.microsoft.com/office/word/2016/wordml/cid" xmlns:w16="http://schemas.microsoft.com/office/word/2018/wordml" xmlns:w16du="http://schemas.microsoft.com/office/word/2023/wordml/word16du" xmlns:w16sdtdh="http://schemas.microsoft.com/office/word/2020/wordml/sdtdatahash" xmlns:w16sdtfl="http://schemas.microsoft.com/office/word/2024/wordml/sdtformatlock" xmlns:w16se="http://schemas.microsoft.com/office/word/2015/wordml/symex" xmlns:wpg="http://schemas.microsoft.com/office/word/2010/wordprocessingGroup" xmlns:wpi="http://schemas.microsoft.com/office/word/2010/wordprocessingInk" xmlns:wne="http://schemas.microsoft.com/office/word/2006/wordml" xmlns:wps="http://schemas.microsoft.com/office/word/2010/wordprocessingShape" mc:Ignorable="w14 w15 w16se w16cid w16 w16cex w16sdtdh w16sdtfl w16du wp14">
+<w:endnotes xmlns:wpc="http://schemas.microsoft.com/office/word/2010/wordprocessingCanvas" xmlns:cx="http://schemas.microsoft.com/office/drawing/2014/chartex" xmlns:mc="http://schemas.openxmlformats.org/markup-compatibility/2006" xmlns:o="urn:schemas-microsoft-com:office:office" xmlns:r="http://schemas.openxmlformats.org/officeDocument/2006/relationships" xmlns:m="http://schemas.openxmlformats.org/officeDocument/2006/math" xmlns:v="urn:schemas-microsoft-com:vml" xmlns:wp14="http://schemas.microsoft.com/office/word/2010/wordprocessingDrawing" xmlns:wp="http://schemas.openxmlformats.org/drawingml/2006/wordprocessingDrawing" xmlns:w10="urn:schemas-microsoft-com:office:word" xmlns:w="http://schemas.openxmlformats.org/wordprocessingml/2006/main" xmlns:w14="http://schemas.microsoft.com/office/word/2010/wordml" xmlns:w15="http://schemas.microsoft.com/office/word/2012/wordml" xmlns:w16se="http://schemas.microsoft.com/office/word/2015/wordml/symex" xmlns:wpg="http://schemas.microsoft.com/office/word/2010/wordprocessingGroup" xmlns:wpi="http://schemas.microsoft.com/office/word/2010/wordprocessingInk" xmlns:wne="http://schemas.microsoft.com/office/word/2006/wordml" xmlns:wps="http://schemas.microsoft.com/office/word/2010/wordprocessingShape" mc:Ignorable="w14 w15 w16se wp14">
   <w:endnote w:type="separator" w:id="-1">
     <w:p>
       <w:pPr>
@@ -1734,7 +1548,7 @@
 </file>
 
 <file path=word/footer1.xml><?xml version="1.0" encoding="utf-8"?>
-<w:ftr xmlns:wpc="http://schemas.microsoft.com/office/word/2010/wordprocessingCanvas" xmlns:cx="http://schemas.microsoft.com/office/drawing/2014/chartex" xmlns:cx1="http://schemas.microsoft.com/office/drawing/2015/9/8/chartex" xmlns:cx2="http://schemas.microsoft.com/office/drawing/2015/10/21/chartex" xmlns:cx3="http://schemas.microsoft.com/office/drawing/2016/5/9/chartex" xmlns:cx4="http://schemas.microsoft.com/office/drawing/2016/5/10/chartex" xmlns:cx5="http://schemas.microsoft.com/office/drawing/2016/5/11/chartex" xmlns:cx6="http://schemas.microsoft.com/office/drawing/2016/5/12/chartex" xmlns:cx7="http://schemas.microsoft.com/office/drawing/2016/5/13/chartex" xmlns:cx8="http://schemas.microsoft.com/office/drawing/2016/5/14/chartex" xmlns:mc="http://schemas.openxmlformats.org/markup-compatibility/2006" xmlns:aink="http://schemas.microsoft.com/office/drawing/2016/ink" xmlns:am3d="http://schemas.microsoft.com/office/drawing/2017/model3d" xmlns:o="urn:schemas-microsoft-com:office:office" xmlns:oel="http://schemas.microsoft.com/office/2019/extlst" xmlns:r="http://schemas.openxmlformats.org/officeDocument/2006/relationships" xmlns:m="http://schemas.openxmlformats.org/officeDocument/2006/math" xmlns:v="urn:schemas-microsoft-com:vml" xmlns:wp14="http://schemas.microsoft.com/office/word/2010/wordprocessingDrawing" xmlns:wp="http://schemas.openxmlformats.org/drawingml/2006/wordprocessingDrawing" xmlns:w10="urn:schemas-microsoft-com:office:word" xmlns:w="http://schemas.openxmlformats.org/wordprocessingml/2006/main" xmlns:w14="http://schemas.microsoft.com/office/word/2010/wordml" xmlns:w15="http://schemas.microsoft.com/office/word/2012/wordml" xmlns:w16cex="http://schemas.microsoft.com/office/word/2018/wordml/cex" xmlns:w16cid="http://schemas.microsoft.com/office/word/2016/wordml/cid" xmlns:w16="http://schemas.microsoft.com/office/word/2018/wordml" xmlns:w16du="http://schemas.microsoft.com/office/word/2023/wordml/word16du" xmlns:w16sdtdh="http://schemas.microsoft.com/office/word/2020/wordml/sdtdatahash" xmlns:w16sdtfl="http://schemas.microsoft.com/office/word/2024/wordml/sdtformatlock" xmlns:w16se="http://schemas.microsoft.com/office/word/2015/wordml/symex" xmlns:wpg="http://schemas.microsoft.com/office/word/2010/wordprocessingGroup" xmlns:wpi="http://schemas.microsoft.com/office/word/2010/wordprocessingInk" xmlns:wne="http://schemas.microsoft.com/office/word/2006/wordml" xmlns:wps="http://schemas.microsoft.com/office/word/2010/wordprocessingShape" mc:Ignorable="w14 w15 w16se w16cid w16 w16cex w16sdtdh w16sdtfl w16du wp14">
+<w:ftr xmlns:wpc="http://schemas.microsoft.com/office/word/2010/wordprocessingCanvas" xmlns:cx="http://schemas.microsoft.com/office/drawing/2014/chartex" xmlns:mc="http://schemas.openxmlformats.org/markup-compatibility/2006" xmlns:o="urn:schemas-microsoft-com:office:office" xmlns:r="http://schemas.openxmlformats.org/officeDocument/2006/relationships" xmlns:m="http://schemas.openxmlformats.org/officeDocument/2006/math" xmlns:v="urn:schemas-microsoft-com:vml" xmlns:wp14="http://schemas.microsoft.com/office/word/2010/wordprocessingDrawing" xmlns:wp="http://schemas.openxmlformats.org/drawingml/2006/wordprocessingDrawing" xmlns:w10="urn:schemas-microsoft-com:office:word" xmlns:w="http://schemas.openxmlformats.org/wordprocessingml/2006/main" xmlns:w14="http://schemas.microsoft.com/office/word/2010/wordml" xmlns:w15="http://schemas.microsoft.com/office/word/2012/wordml" xmlns:w16se="http://schemas.microsoft.com/office/word/2015/wordml/symex" xmlns:wpg="http://schemas.microsoft.com/office/word/2010/wordprocessingGroup" xmlns:wpi="http://schemas.microsoft.com/office/word/2010/wordprocessingInk" xmlns:wne="http://schemas.microsoft.com/office/word/2006/wordml" xmlns:wps="http://schemas.microsoft.com/office/word/2010/wordprocessingShape" mc:Ignorable="w14 w15 w16se wp14">
   <w:p>
     <w:pPr>
       <w:tabs>
@@ -1800,7 +1614,7 @@
         <w:szCs w:val="24"/>
         <w:lang w:val="es-MX"/>
       </w:rPr>
-      <w:t>4</w:t>
+      <w:t>6</w:t>
     </w:r>
     <w:r>
       <w:rPr>
@@ -1851,7 +1665,7 @@
         <w:szCs w:val="24"/>
         <w:lang w:val="es-MX"/>
       </w:rPr>
-      <w:t>5</w:t>
+      <w:t>6</w:t>
     </w:r>
     <w:r>
       <w:rPr>
@@ -1871,7 +1685,7 @@
 </file>
 
 <file path=word/footnotes.xml><?xml version="1.0" encoding="utf-8"?>
-<w:footnotes xmlns:wpc="http://schemas.microsoft.com/office/word/2010/wordprocessingCanvas" xmlns:cx="http://schemas.microsoft.com/office/drawing/2014/chartex" xmlns:cx1="http://schemas.microsoft.com/office/drawing/2015/9/8/chartex" xmlns:cx2="http://schemas.microsoft.com/office/drawing/2015/10/21/chartex" xmlns:cx3="http://schemas.microsoft.com/office/drawing/2016/5/9/chartex" xmlns:cx4="http://schemas.microsoft.com/office/drawing/2016/5/10/chartex" xmlns:cx5="http://schemas.microsoft.com/office/drawing/2016/5/11/chartex" xmlns:cx6="http://schemas.microsoft.com/office/drawing/2016/5/12/chartex" xmlns:cx7="http://schemas.microsoft.com/office/drawing/2016/5/13/chartex" xmlns:cx8="http://schemas.microsoft.com/office/drawing/2016/5/14/chartex" xmlns:mc="http://schemas.openxmlformats.org/markup-compatibility/2006" xmlns:aink="http://schemas.microsoft.com/office/drawing/2016/ink" xmlns:am3d="http://schemas.microsoft.com/office/drawing/2017/model3d" xmlns:o="urn:schemas-microsoft-com:office:office" xmlns:oel="http://schemas.microsoft.com/office/2019/extlst" xmlns:r="http://schemas.openxmlformats.org/officeDocument/2006/relationships" xmlns:m="http://schemas.openxmlformats.org/officeDocument/2006/math" xmlns:v="urn:schemas-microsoft-com:vml" xmlns:wp14="http://schemas.microsoft.com/office/word/2010/wordprocessingDrawing" xmlns:wp="http://schemas.openxmlformats.org/drawingml/2006/wordprocessingDrawing" xmlns:w10="urn:schemas-microsoft-com:office:word" xmlns:w="http://schemas.openxmlformats.org/wordprocessingml/2006/main" xmlns:w14="http://schemas.microsoft.com/office/word/2010/wordml" xmlns:w15="http://schemas.microsoft.com/office/word/2012/wordml" xmlns:w16cex="http://schemas.microsoft.com/office/word/2018/wordml/cex" xmlns:w16cid="http://schemas.microsoft.com/office/word/2016/wordml/cid" xmlns:w16="http://schemas.microsoft.com/office/word/2018/wordml" xmlns:w16du="http://schemas.microsoft.com/office/word/2023/wordml/word16du" xmlns:w16sdtdh="http://schemas.microsoft.com/office/word/2020/wordml/sdtdatahash" xmlns:w16sdtfl="http://schemas.microsoft.com/office/word/2024/wordml/sdtformatlock" xmlns:w16se="http://schemas.microsoft.com/office/word/2015/wordml/symex" xmlns:wpg="http://schemas.microsoft.com/office/word/2010/wordprocessingGroup" xmlns:wpi="http://schemas.microsoft.com/office/word/2010/wordprocessingInk" xmlns:wne="http://schemas.microsoft.com/office/word/2006/wordml" xmlns:wps="http://schemas.microsoft.com/office/word/2010/wordprocessingShape" mc:Ignorable="w14 w15 w16se w16cid w16 w16cex w16sdtdh w16sdtfl w16du wp14">
+<w:footnotes xmlns:wpc="http://schemas.microsoft.com/office/word/2010/wordprocessingCanvas" xmlns:cx="http://schemas.microsoft.com/office/drawing/2014/chartex" xmlns:mc="http://schemas.openxmlformats.org/markup-compatibility/2006" xmlns:o="urn:schemas-microsoft-com:office:office" xmlns:r="http://schemas.openxmlformats.org/officeDocument/2006/relationships" xmlns:m="http://schemas.openxmlformats.org/officeDocument/2006/math" xmlns:v="urn:schemas-microsoft-com:vml" xmlns:wp14="http://schemas.microsoft.com/office/word/2010/wordprocessingDrawing" xmlns:wp="http://schemas.openxmlformats.org/drawingml/2006/wordprocessingDrawing" xmlns:w10="urn:schemas-microsoft-com:office:word" xmlns:w="http://schemas.openxmlformats.org/wordprocessingml/2006/main" xmlns:w14="http://schemas.microsoft.com/office/word/2010/wordml" xmlns:w15="http://schemas.microsoft.com/office/word/2012/wordml" xmlns:w16se="http://schemas.microsoft.com/office/word/2015/wordml/symex" xmlns:wpg="http://schemas.microsoft.com/office/word/2010/wordprocessingGroup" xmlns:wpi="http://schemas.microsoft.com/office/word/2010/wordprocessingInk" xmlns:wne="http://schemas.microsoft.com/office/word/2006/wordml" xmlns:wps="http://schemas.microsoft.com/office/word/2010/wordprocessingShape" mc:Ignorable="w14 w15 w16se wp14">
   <w:footnote w:type="separator" w:id="-1">
     <w:p>
       <w:pPr>
@@ -1896,7 +1710,7 @@
 </file>
 
 <file path=word/numbering.xml><?xml version="1.0" encoding="utf-8"?>
-<w:numbering xmlns:wpc="http://schemas.microsoft.com/office/word/2010/wordprocessingCanvas" xmlns:cx="http://schemas.microsoft.com/office/drawing/2014/chartex" xmlns:cx1="http://schemas.microsoft.com/office/drawing/2015/9/8/chartex" xmlns:cx2="http://schemas.microsoft.com/office/drawing/2015/10/21/chartex" xmlns:cx3="http://schemas.microsoft.com/office/drawing/2016/5/9/chartex" xmlns:cx4="http://schemas.microsoft.com/office/drawing/2016/5/10/chartex" xmlns:cx5="http://schemas.microsoft.com/office/drawing/2016/5/11/chartex" xmlns:cx6="http://schemas.microsoft.com/office/drawing/2016/5/12/chartex" xmlns:cx7="http://schemas.microsoft.com/office/drawing/2016/5/13/chartex" xmlns:cx8="http://schemas.microsoft.com/office/drawing/2016/5/14/chartex" xmlns:mc="http://schemas.openxmlformats.org/markup-compatibility/2006" xmlns:aink="http://schemas.microsoft.com/office/drawing/2016/ink" xmlns:am3d="http://schemas.microsoft.com/office/drawing/2017/model3d" xmlns:o="urn:schemas-microsoft-com:office:office" xmlns:oel="http://schemas.microsoft.com/office/2019/extlst" xmlns:r="http://schemas.openxmlformats.org/officeDocument/2006/relationships" xmlns:m="http://schemas.openxmlformats.org/officeDocument/2006/math" xmlns:v="urn:schemas-microsoft-com:vml" xmlns:wp14="http://schemas.microsoft.com/office/word/2010/wordprocessingDrawing" xmlns:wp="http://schemas.openxmlformats.org/drawingml/2006/wordprocessingDrawing" xmlns:w10="urn:schemas-microsoft-com:office:word" xmlns:w="http://schemas.openxmlformats.org/wordprocessingml/2006/main" xmlns:w14="http://schemas.microsoft.com/office/word/2010/wordml" xmlns:w15="http://schemas.microsoft.com/office/word/2012/wordml" xmlns:w16cex="http://schemas.microsoft.com/office/word/2018/wordml/cex" xmlns:w16cid="http://schemas.microsoft.com/office/word/2016/wordml/cid" xmlns:w16="http://schemas.microsoft.com/office/word/2018/wordml" xmlns:w16du="http://schemas.microsoft.com/office/word/2023/wordml/word16du" xmlns:w16sdtdh="http://schemas.microsoft.com/office/word/2020/wordml/sdtdatahash" xmlns:w16sdtfl="http://schemas.microsoft.com/office/word/2024/wordml/sdtformatlock" xmlns:w16se="http://schemas.microsoft.com/office/word/2015/wordml/symex" xmlns:wpg="http://schemas.microsoft.com/office/word/2010/wordprocessingGroup" xmlns:wpi="http://schemas.microsoft.com/office/word/2010/wordprocessingInk" xmlns:wne="http://schemas.microsoft.com/office/word/2006/wordml" xmlns:wps="http://schemas.microsoft.com/office/word/2010/wordprocessingShape" mc:Ignorable="w14 w15 w16se w16cid w16 w16cex w16sdtdh w16sdtfl w16du wp14">
+<w:numbering xmlns:wpc="http://schemas.microsoft.com/office/word/2010/wordprocessingCanvas" xmlns:cx="http://schemas.microsoft.com/office/drawing/2014/chartex" xmlns:mc="http://schemas.openxmlformats.org/markup-compatibility/2006" xmlns:o="urn:schemas-microsoft-com:office:office" xmlns:r="http://schemas.openxmlformats.org/officeDocument/2006/relationships" xmlns:m="http://schemas.openxmlformats.org/officeDocument/2006/math" xmlns:v="urn:schemas-microsoft-com:vml" xmlns:wp14="http://schemas.microsoft.com/office/word/2010/wordprocessingDrawing" xmlns:wp="http://schemas.openxmlformats.org/drawingml/2006/wordprocessingDrawing" xmlns:w10="urn:schemas-microsoft-com:office:word" xmlns:w="http://schemas.openxmlformats.org/wordprocessingml/2006/main" xmlns:w14="http://schemas.microsoft.com/office/word/2010/wordml" xmlns:w15="http://schemas.microsoft.com/office/word/2012/wordml" xmlns:w16se="http://schemas.microsoft.com/office/word/2015/wordml/symex" xmlns:wpg="http://schemas.microsoft.com/office/word/2010/wordprocessingGroup" xmlns:wpi="http://schemas.microsoft.com/office/word/2010/wordprocessingInk" xmlns:wne="http://schemas.microsoft.com/office/word/2006/wordml" xmlns:wps="http://schemas.microsoft.com/office/word/2010/wordprocessingShape" mc:Ignorable="w14 w15 w16se wp14">
   <w:abstractNum w:abstractNumId="0" w15:restartNumberingAfterBreak="0">
     <w:nsid w:val="0250685B"/>
     <w:multiLevelType w:val="hybridMultilevel"/>
@@ -4531,83 +4345,83 @@
       </w:pPr>
     </w:lvl>
   </w:abstractNum>
-  <w:num w:numId="1" w16cid:durableId="1030648999">
+  <w:num w:numId="1">
     <w:abstractNumId w:val="15"/>
   </w:num>
-  <w:num w:numId="2" w16cid:durableId="1617562501">
+  <w:num w:numId="2">
     <w:abstractNumId w:val="11"/>
   </w:num>
-  <w:num w:numId="3" w16cid:durableId="3484874">
+  <w:num w:numId="3">
     <w:abstractNumId w:val="10"/>
   </w:num>
-  <w:num w:numId="4" w16cid:durableId="1356687633">
+  <w:num w:numId="4">
     <w:abstractNumId w:val="13"/>
   </w:num>
-  <w:num w:numId="5" w16cid:durableId="1239366344">
+  <w:num w:numId="5">
     <w:abstractNumId w:val="21"/>
   </w:num>
-  <w:num w:numId="6" w16cid:durableId="1488281850">
+  <w:num w:numId="6">
     <w:abstractNumId w:val="3"/>
   </w:num>
-  <w:num w:numId="7" w16cid:durableId="4601140">
+  <w:num w:numId="7">
     <w:abstractNumId w:val="14"/>
   </w:num>
-  <w:num w:numId="8" w16cid:durableId="1021470701">
+  <w:num w:numId="8">
     <w:abstractNumId w:val="9"/>
   </w:num>
-  <w:num w:numId="9" w16cid:durableId="795175029">
+  <w:num w:numId="9">
     <w:abstractNumId w:val="4"/>
   </w:num>
-  <w:num w:numId="10" w16cid:durableId="1639996300">
+  <w:num w:numId="10">
     <w:abstractNumId w:val="0"/>
   </w:num>
-  <w:num w:numId="11" w16cid:durableId="307247604">
+  <w:num w:numId="11">
     <w:abstractNumId w:val="23"/>
   </w:num>
-  <w:num w:numId="12" w16cid:durableId="48841996">
+  <w:num w:numId="12">
     <w:abstractNumId w:val="7"/>
   </w:num>
-  <w:num w:numId="13" w16cid:durableId="643630047">
+  <w:num w:numId="13">
     <w:abstractNumId w:val="18"/>
   </w:num>
-  <w:num w:numId="14" w16cid:durableId="18162890">
+  <w:num w:numId="14">
     <w:abstractNumId w:val="17"/>
   </w:num>
-  <w:num w:numId="15" w16cid:durableId="204290435">
+  <w:num w:numId="15">
     <w:abstractNumId w:val="12"/>
   </w:num>
-  <w:num w:numId="16" w16cid:durableId="1997490861">
+  <w:num w:numId="16">
     <w:abstractNumId w:val="5"/>
   </w:num>
-  <w:num w:numId="17" w16cid:durableId="678970645">
+  <w:num w:numId="17">
     <w:abstractNumId w:val="2"/>
   </w:num>
-  <w:num w:numId="18" w16cid:durableId="1360084481">
+  <w:num w:numId="18">
     <w:abstractNumId w:val="19"/>
   </w:num>
-  <w:num w:numId="19" w16cid:durableId="514270365">
+  <w:num w:numId="19">
     <w:abstractNumId w:val="20"/>
   </w:num>
-  <w:num w:numId="20" w16cid:durableId="378212915">
+  <w:num w:numId="20">
     <w:abstractNumId w:val="6"/>
   </w:num>
-  <w:num w:numId="21" w16cid:durableId="1891765018">
+  <w:num w:numId="21">
     <w:abstractNumId w:val="8"/>
   </w:num>
-  <w:num w:numId="22" w16cid:durableId="981546197">
+  <w:num w:numId="22">
     <w:abstractNumId w:val="16"/>
   </w:num>
-  <w:num w:numId="23" w16cid:durableId="1083144417">
+  <w:num w:numId="23">
     <w:abstractNumId w:val="1"/>
   </w:num>
-  <w:num w:numId="24" w16cid:durableId="208804011">
+  <w:num w:numId="24">
     <w:abstractNumId w:val="22"/>
   </w:num>
 </w:numbering>
 </file>
 
 <file path=word/styles.xml><?xml version="1.0" encoding="utf-8"?>
-<w:styles xmlns:mc="http://schemas.openxmlformats.org/markup-compatibility/2006" xmlns:r="http://schemas.openxmlformats.org/officeDocument/2006/relationships" xmlns:w="http://schemas.openxmlformats.org/wordprocessingml/2006/main" xmlns:w14="http://schemas.microsoft.com/office/word/2010/wordml" xmlns:w15="http://schemas.microsoft.com/office/word/2012/wordml" xmlns:w16cex="http://schemas.microsoft.com/office/word/2018/wordml/cex" xmlns:w16cid="http://schemas.microsoft.com/office/word/2016/wordml/cid" xmlns:w16="http://schemas.microsoft.com/office/word/2018/wordml" xmlns:w16du="http://schemas.microsoft.com/office/word/2023/wordml/word16du" xmlns:w16sdtdh="http://schemas.microsoft.com/office/word/2020/wordml/sdtdatahash" xmlns:w16sdtfl="http://schemas.microsoft.com/office/word/2024/wordml/sdtformatlock" xmlns:w16se="http://schemas.microsoft.com/office/word/2015/wordml/symex" mc:Ignorable="w14 w15 w16se w16cid w16 w16cex w16sdtdh w16sdtfl w16du">
+<w:styles xmlns:mc="http://schemas.openxmlformats.org/markup-compatibility/2006" xmlns:r="http://schemas.openxmlformats.org/officeDocument/2006/relationships" xmlns:w="http://schemas.openxmlformats.org/wordprocessingml/2006/main" xmlns:w14="http://schemas.microsoft.com/office/word/2010/wordml" xmlns:w15="http://schemas.microsoft.com/office/word/2012/wordml" xmlns:w16se="http://schemas.microsoft.com/office/word/2015/wordml/symex" mc:Ignorable="w14 w15 w16se">
   <w:docDefaults>
     <w:rPrDefault>
       <w:rPr>
@@ -4623,7 +4437,7 @@
       </w:pPr>
     </w:pPrDefault>
   </w:docDefaults>
-  <w:latentStyles w:defLockedState="0" w:defUIPriority="99" w:defSemiHidden="0" w:defUnhideWhenUsed="0" w:defQFormat="0" w:count="376">
+  <w:latentStyles w:defLockedState="0" w:defUIPriority="99" w:defSemiHidden="0" w:defUnhideWhenUsed="0" w:defQFormat="0" w:count="371">
     <w:lsdException w:name="Normal" w:uiPriority="0" w:qFormat="1"/>
     <w:lsdException w:name="heading 1" w:uiPriority="9" w:qFormat="1"/>
     <w:lsdException w:name="heading 2" w:semiHidden="1" w:uiPriority="9" w:unhideWhenUsed="1" w:qFormat="1"/>
@@ -4995,11 +4809,6 @@
     <w:lsdException w:name="List Table 5 Dark Accent 6" w:uiPriority="50"/>
     <w:lsdException w:name="List Table 6 Colorful Accent 6" w:uiPriority="51"/>
     <w:lsdException w:name="List Table 7 Colorful Accent 6" w:uiPriority="52"/>
-    <w:lsdException w:name="Mention" w:semiHidden="1" w:unhideWhenUsed="1"/>
-    <w:lsdException w:name="Smart Hyperlink" w:semiHidden="1" w:unhideWhenUsed="1"/>
-    <w:lsdException w:name="Hashtag" w:semiHidden="1" w:unhideWhenUsed="1"/>
-    <w:lsdException w:name="Unresolved Mention" w:semiHidden="1" w:unhideWhenUsed="1"/>
-    <w:lsdException w:name="Smart Link" w:semiHidden="1" w:unhideWhenUsed="1"/>
   </w:latentStyles>
   <w:style w:type="paragraph" w:default="1" w:styleId="Normal">
     <w:name w:val="Normal"/>
@@ -5060,6 +4869,7 @@
   <w:style w:type="character" w:default="1" w:styleId="Fuentedeprrafopredeter">
     <w:name w:val="Default Paragraph Font"/>
     <w:uiPriority w:val="1"/>
+    <w:semiHidden/>
     <w:unhideWhenUsed/>
   </w:style>
   <w:style w:type="table" w:default="1" w:styleId="Tablanormal">
@@ -5306,7 +5116,7 @@
       <w:contextualSpacing/>
     </w:pPr>
   </w:style>
-  <w:style w:type="character" w:styleId="Fuerte">
+  <w:style w:type="character" w:styleId="Textoennegrita">
     <w:name w:val="Strong"/>
     <w:basedOn w:val="Fuentedeprrafopredeter"/>
     <w:uiPriority w:val="22"/>
@@ -5657,7 +5467,7 @@
 </file>
 
 <file path=customXml/itemProps1.xml><?xml version="1.0" encoding="utf-8"?>
-<ds:datastoreItem xmlns:ds="http://schemas.openxmlformats.org/officeDocument/2006/customXml" ds:itemID="{7CAFDE94-0670-4DE4-9A7E-97A15E7356FF}">
+<ds:datastoreItem xmlns:ds="http://schemas.openxmlformats.org/officeDocument/2006/customXml" ds:itemID="{EBE43E1A-7734-4F78-A5DE-1D4C3E616A6C}">
   <ds:schemaRefs>
     <ds:schemaRef ds:uri="http://schemas.openxmlformats.org/officeDocument/2006/bibliography"/>
   </ds:schemaRefs>

</xml_diff>

<commit_message>
agregado cambios en el informe TP2
</commit_message>
<xml_diff>
--- a/TP2/Entregable.docx
+++ b/TP2/Entregable.docx
@@ -1,6 +1,6 @@
 
 <file path=word/document.xml><?xml version="1.0" encoding="utf-8"?>
-<w:document xmlns:wpc="http://schemas.microsoft.com/office/word/2010/wordprocessingCanvas" xmlns:cx="http://schemas.microsoft.com/office/drawing/2014/chartex" xmlns:cx1="http://schemas.microsoft.com/office/drawing/2015/9/8/chartex" xmlns:cx2="http://schemas.microsoft.com/office/drawing/2015/10/21/chartex" xmlns:cx3="http://schemas.microsoft.com/office/drawing/2016/5/9/chartex" xmlns:cx4="http://schemas.microsoft.com/office/drawing/2016/5/10/chartex" xmlns:cx5="http://schemas.microsoft.com/office/drawing/2016/5/11/chartex" xmlns:cx6="http://schemas.microsoft.com/office/drawing/2016/5/12/chartex" xmlns:cx7="http://schemas.microsoft.com/office/drawing/2016/5/13/chartex" xmlns:cx8="http://schemas.microsoft.com/office/drawing/2016/5/14/chartex" xmlns:mc="http://schemas.openxmlformats.org/markup-compatibility/2006" xmlns:aink="http://schemas.microsoft.com/office/drawing/2016/ink" xmlns:am3d="http://schemas.microsoft.com/office/drawing/2017/model3d" xmlns:o="urn:schemas-microsoft-com:office:office" xmlns:oel="http://schemas.microsoft.com/office/2019/extlst" xmlns:r="http://schemas.openxmlformats.org/officeDocument/2006/relationships" xmlns:m="http://schemas.openxmlformats.org/officeDocument/2006/math" xmlns:v="urn:schemas-microsoft-com:vml" xmlns:wp14="http://schemas.microsoft.com/office/word/2010/wordprocessingDrawing" xmlns:wp="http://schemas.openxmlformats.org/drawingml/2006/wordprocessingDrawing" xmlns:w10="urn:schemas-microsoft-com:office:word" xmlns:w="http://schemas.openxmlformats.org/wordprocessingml/2006/main" xmlns:w14="http://schemas.microsoft.com/office/word/2010/wordml" xmlns:w15="http://schemas.microsoft.com/office/word/2012/wordml" xmlns:w16cex="http://schemas.microsoft.com/office/word/2018/wordml/cex" xmlns:w16cid="http://schemas.microsoft.com/office/word/2016/wordml/cid" xmlns:w16="http://schemas.microsoft.com/office/word/2018/wordml" xmlns:w16du="http://schemas.microsoft.com/office/word/2023/wordml/word16du" xmlns:w16sdtdh="http://schemas.microsoft.com/office/word/2020/wordml/sdtdatahash" xmlns:w16sdtfl="http://schemas.microsoft.com/office/word/2024/wordml/sdtformatlock" xmlns:w16se="http://schemas.microsoft.com/office/word/2015/wordml/symex" xmlns:wpg="http://schemas.microsoft.com/office/word/2010/wordprocessingGroup" xmlns:wpi="http://schemas.microsoft.com/office/word/2010/wordprocessingInk" xmlns:wne="http://schemas.microsoft.com/office/word/2006/wordml" xmlns:wps="http://schemas.microsoft.com/office/word/2010/wordprocessingShape" mc:Ignorable="w14 w15 w16se w16cid w16 w16cex w16sdtdh w16sdtfl w16du wp14">
+<w:document xmlns:wpc="http://schemas.microsoft.com/office/word/2010/wordprocessingCanvas" xmlns:cx="http://schemas.microsoft.com/office/drawing/2014/chartex" xmlns:mc="http://schemas.openxmlformats.org/markup-compatibility/2006" xmlns:o="urn:schemas-microsoft-com:office:office" xmlns:r="http://schemas.openxmlformats.org/officeDocument/2006/relationships" xmlns:m="http://schemas.openxmlformats.org/officeDocument/2006/math" xmlns:v="urn:schemas-microsoft-com:vml" xmlns:wp14="http://schemas.microsoft.com/office/word/2010/wordprocessingDrawing" xmlns:wp="http://schemas.openxmlformats.org/drawingml/2006/wordprocessingDrawing" xmlns:w10="urn:schemas-microsoft-com:office:word" xmlns:w="http://schemas.openxmlformats.org/wordprocessingml/2006/main" xmlns:w14="http://schemas.microsoft.com/office/word/2010/wordml" xmlns:w15="http://schemas.microsoft.com/office/word/2012/wordml" xmlns:w16se="http://schemas.microsoft.com/office/word/2015/wordml/symex" xmlns:wpg="http://schemas.microsoft.com/office/word/2010/wordprocessingGroup" xmlns:wpi="http://schemas.microsoft.com/office/word/2010/wordprocessingInk" xmlns:wne="http://schemas.microsoft.com/office/word/2006/wordml" xmlns:wps="http://schemas.microsoft.com/office/word/2010/wordprocessingShape" mc:Ignorable="w14 w15 w16se wp14">
   <w:body>
     <w:p>
       <w:pPr>
@@ -342,11 +342,8 @@
             <w:rPr>
               <w:rFonts w:asciiTheme="minorHAnsi" w:eastAsiaTheme="minorEastAsia" w:hAnsiTheme="minorHAnsi"/>
               <w:noProof/>
-              <w:kern w:val="2"/>
-              <w:sz w:val="24"/>
-              <w:szCs w:val="24"/>
+              <w:sz w:val="22"/>
               <w:lang w:eastAsia="es-AR"/>
-              <w14:ligatures w14:val="standardContextual"/>
             </w:rPr>
           </w:pPr>
           <w:r>
@@ -358,13 +355,131 @@
           <w:r>
             <w:fldChar w:fldCharType="separate"/>
           </w:r>
-          <w:hyperlink w:anchor="_Toc231218692" w:history="1">
+          <w:bookmarkStart w:id="0" w:name="_GoBack"/>
+          <w:bookmarkEnd w:id="0"/>
+          <w:r>
+            <w:rPr>
+              <w:rStyle w:val="Hipervnculo"/>
+              <w:noProof/>
+            </w:rPr>
+            <w:fldChar w:fldCharType="begin"/>
+          </w:r>
+          <w:r>
+            <w:rPr>
+              <w:rStyle w:val="Hipervnculo"/>
+              <w:noProof/>
+            </w:rPr>
+            <w:instrText xml:space="preserve"> </w:instrText>
+          </w:r>
+          <w:r>
+            <w:rPr>
+              <w:noProof/>
+            </w:rPr>
+            <w:instrText>HYPERLINK \l "_Toc231549183"</w:instrText>
+          </w:r>
+          <w:r>
+            <w:rPr>
+              <w:rStyle w:val="Hipervnculo"/>
+              <w:noProof/>
+            </w:rPr>
+            <w:instrText xml:space="preserve"> </w:instrText>
+          </w:r>
+          <w:r>
+            <w:rPr>
+              <w:rStyle w:val="Hipervnculo"/>
+              <w:noProof/>
+            </w:rPr>
+          </w:r>
+          <w:r>
+            <w:rPr>
+              <w:rStyle w:val="Hipervnculo"/>
+              <w:noProof/>
+            </w:rPr>
+            <w:fldChar w:fldCharType="separate"/>
+          </w:r>
+          <w:r>
+            <w:rPr>
+              <w:rStyle w:val="Hipervnculo"/>
+              <w:noProof/>
+            </w:rPr>
+            <w:t>Introducción:</w:t>
+          </w:r>
+          <w:r>
+            <w:rPr>
+              <w:noProof/>
+              <w:webHidden/>
+            </w:rPr>
+            <w:tab/>
+          </w:r>
+          <w:r>
+            <w:rPr>
+              <w:noProof/>
+              <w:webHidden/>
+            </w:rPr>
+            <w:fldChar w:fldCharType="begin"/>
+          </w:r>
+          <w:r>
+            <w:rPr>
+              <w:noProof/>
+              <w:webHidden/>
+            </w:rPr>
+            <w:instrText xml:space="preserve"> PAGEREF _Toc231549183 \h </w:instrText>
+          </w:r>
+          <w:r>
+            <w:rPr>
+              <w:noProof/>
+              <w:webHidden/>
+            </w:rPr>
+          </w:r>
+          <w:r>
+            <w:rPr>
+              <w:noProof/>
+              <w:webHidden/>
+            </w:rPr>
+            <w:fldChar w:fldCharType="separate"/>
+          </w:r>
+          <w:r>
+            <w:rPr>
+              <w:noProof/>
+              <w:webHidden/>
+            </w:rPr>
+            <w:t>3</w:t>
+          </w:r>
+          <w:r>
+            <w:rPr>
+              <w:noProof/>
+              <w:webHidden/>
+            </w:rPr>
+            <w:fldChar w:fldCharType="end"/>
+          </w:r>
+          <w:r>
+            <w:rPr>
+              <w:rStyle w:val="Hipervnculo"/>
+              <w:noProof/>
+            </w:rPr>
+            <w:fldChar w:fldCharType="end"/>
+          </w:r>
+        </w:p>
+        <w:p>
+          <w:pPr>
+            <w:pStyle w:val="TDC1"/>
+            <w:tabs>
+              <w:tab w:val="right" w:leader="dot" w:pos="8494"/>
+            </w:tabs>
+            <w:rPr>
+              <w:rFonts w:asciiTheme="minorHAnsi" w:eastAsiaTheme="minorEastAsia" w:hAnsiTheme="minorHAnsi"/>
+              <w:noProof/>
+              <w:sz w:val="22"/>
+              <w:lang w:eastAsia="es-AR"/>
+            </w:rPr>
+          </w:pPr>
+          <w:hyperlink w:anchor="_Toc231549184" w:history="1">
             <w:r>
               <w:rPr>
                 <w:rStyle w:val="Hipervnculo"/>
                 <w:noProof/>
               </w:rPr>
-              <w:t>Introducción:</w:t>
+              <w:t>Inciso 1:</w:t>
             </w:r>
             <w:r>
               <w:rPr>
@@ -385,7 +500,7 @@
                 <w:noProof/>
                 <w:webHidden/>
               </w:rPr>
-              <w:instrText xml:space="preserve"> PAGEREF _Toc231218692 \h </w:instrText>
+              <w:instrText xml:space="preserve"> PAGEREF _Toc231549184 \h </w:instrText>
             </w:r>
             <w:r>
               <w:rPr>
@@ -425,88 +540,11 @@
             <w:rPr>
               <w:rFonts w:asciiTheme="minorHAnsi" w:eastAsiaTheme="minorEastAsia" w:hAnsiTheme="minorHAnsi"/>
               <w:noProof/>
-              <w:kern w:val="2"/>
-              <w:sz w:val="24"/>
-              <w:szCs w:val="24"/>
+              <w:sz w:val="22"/>
               <w:lang w:eastAsia="es-AR"/>
-              <w14:ligatures w14:val="standardContextual"/>
             </w:rPr>
           </w:pPr>
-          <w:hyperlink w:anchor="_Toc231218693" w:history="1">
-            <w:r>
-              <w:rPr>
-                <w:rStyle w:val="Hipervnculo"/>
-                <w:noProof/>
-              </w:rPr>
-              <w:t>Inciso 1:</w:t>
-            </w:r>
-            <w:r>
-              <w:rPr>
-                <w:noProof/>
-                <w:webHidden/>
-              </w:rPr>
-              <w:tab/>
-            </w:r>
-            <w:r>
-              <w:rPr>
-                <w:noProof/>
-                <w:webHidden/>
-              </w:rPr>
-              <w:fldChar w:fldCharType="begin"/>
-            </w:r>
-            <w:r>
-              <w:rPr>
-                <w:noProof/>
-                <w:webHidden/>
-              </w:rPr>
-              <w:instrText xml:space="preserve"> PAGEREF _Toc231218693 \h </w:instrText>
-            </w:r>
-            <w:r>
-              <w:rPr>
-                <w:noProof/>
-                <w:webHidden/>
-              </w:rPr>
-            </w:r>
-            <w:r>
-              <w:rPr>
-                <w:noProof/>
-                <w:webHidden/>
-              </w:rPr>
-              <w:fldChar w:fldCharType="separate"/>
-            </w:r>
-            <w:r>
-              <w:rPr>
-                <w:noProof/>
-                <w:webHidden/>
-              </w:rPr>
-              <w:t>3</w:t>
-            </w:r>
-            <w:r>
-              <w:rPr>
-                <w:noProof/>
-                <w:webHidden/>
-              </w:rPr>
-              <w:fldChar w:fldCharType="end"/>
-            </w:r>
-          </w:hyperlink>
-        </w:p>
-        <w:p>
-          <w:pPr>
-            <w:pStyle w:val="TDC1"/>
-            <w:tabs>
-              <w:tab w:val="right" w:leader="dot" w:pos="8494"/>
-            </w:tabs>
-            <w:rPr>
-              <w:rFonts w:asciiTheme="minorHAnsi" w:eastAsiaTheme="minorEastAsia" w:hAnsiTheme="minorHAnsi"/>
-              <w:noProof/>
-              <w:kern w:val="2"/>
-              <w:sz w:val="24"/>
-              <w:szCs w:val="24"/>
-              <w:lang w:eastAsia="es-AR"/>
-              <w14:ligatures w14:val="standardContextual"/>
-            </w:rPr>
-          </w:pPr>
-          <w:hyperlink w:anchor="_Toc231218694" w:history="1">
+          <w:hyperlink w:anchor="_Toc231549185" w:history="1">
             <w:r>
               <w:rPr>
                 <w:rStyle w:val="Hipervnculo"/>
@@ -533,7 +571,7 @@
                 <w:noProof/>
                 <w:webHidden/>
               </w:rPr>
-              <w:instrText xml:space="preserve"> PAGEREF _Toc231218694 \h </w:instrText>
+              <w:instrText xml:space="preserve"> PAGEREF _Toc231549185 \h </w:instrText>
             </w:r>
             <w:r>
               <w:rPr>
@@ -573,14 +611,11 @@
             <w:rPr>
               <w:rFonts w:asciiTheme="minorHAnsi" w:eastAsiaTheme="minorEastAsia" w:hAnsiTheme="minorHAnsi"/>
               <w:noProof/>
-              <w:kern w:val="2"/>
-              <w:sz w:val="24"/>
-              <w:szCs w:val="24"/>
+              <w:sz w:val="22"/>
               <w:lang w:eastAsia="es-AR"/>
-              <w14:ligatures w14:val="standardContextual"/>
             </w:rPr>
           </w:pPr>
-          <w:hyperlink w:anchor="_Toc231218695" w:history="1">
+          <w:hyperlink w:anchor="_Toc231549186" w:history="1">
             <w:r>
               <w:rPr>
                 <w:rStyle w:val="Hipervnculo"/>
@@ -607,7 +642,7 @@
                 <w:noProof/>
                 <w:webHidden/>
               </w:rPr>
-              <w:instrText xml:space="preserve"> PAGEREF _Toc231218695 \h </w:instrText>
+              <w:instrText xml:space="preserve"> PAGEREF _Toc231549186 \h </w:instrText>
             </w:r>
             <w:r>
               <w:rPr>
@@ -647,14 +682,11 @@
             <w:rPr>
               <w:rFonts w:asciiTheme="minorHAnsi" w:eastAsiaTheme="minorEastAsia" w:hAnsiTheme="minorHAnsi"/>
               <w:noProof/>
-              <w:kern w:val="2"/>
-              <w:sz w:val="24"/>
-              <w:szCs w:val="24"/>
+              <w:sz w:val="22"/>
               <w:lang w:eastAsia="es-AR"/>
-              <w14:ligatures w14:val="standardContextual"/>
             </w:rPr>
           </w:pPr>
-          <w:hyperlink w:anchor="_Toc231218696" w:history="1">
+          <w:hyperlink w:anchor="_Toc231549187" w:history="1">
             <w:r>
               <w:rPr>
                 <w:rStyle w:val="Hipervnculo"/>
@@ -681,7 +713,7 @@
                 <w:noProof/>
                 <w:webHidden/>
               </w:rPr>
-              <w:instrText xml:space="preserve"> PAGEREF _Toc231218696 \h </w:instrText>
+              <w:instrText xml:space="preserve"> PAGEREF _Toc231549187 \h </w:instrText>
             </w:r>
             <w:r>
               <w:rPr>
@@ -734,12 +766,12 @@
       <w:pPr>
         <w:pStyle w:val="Ttulo1"/>
       </w:pPr>
-      <w:bookmarkStart w:id="0" w:name="_Toc231218692"/>
+      <w:bookmarkStart w:id="1" w:name="_Toc231549183"/>
       <w:r>
         <w:lastRenderedPageBreak/>
         <w:t>Introducción:</w:t>
       </w:r>
-      <w:bookmarkEnd w:id="0"/>
+      <w:bookmarkEnd w:id="1"/>
     </w:p>
     <w:p>
       <w:r>
@@ -771,15 +803,7 @@
         <w:t xml:space="preserve"> donde iremos subiendo los trabajos prácticos durante el año</w:t>
       </w:r>
       <w:r>
-        <w:t xml:space="preserve">, el cual está en el siguiente </w:t>
-      </w:r>
-      <w:proofErr w:type="gramStart"/>
-      <w:r>
-        <w:t>link</w:t>
-      </w:r>
-      <w:proofErr w:type="gramEnd"/>
-      <w:r>
-        <w:t>:</w:t>
+        <w:t>, el cual está en el siguiente link:</w:t>
       </w:r>
     </w:p>
     <w:p>
@@ -799,11 +823,11 @@
       <w:pPr>
         <w:pStyle w:val="Ttulo1"/>
       </w:pPr>
-      <w:bookmarkStart w:id="1" w:name="_Toc231218693"/>
+      <w:bookmarkStart w:id="2" w:name="_Toc231549184"/>
       <w:r>
         <w:t>Inciso 1:</w:t>
       </w:r>
-      <w:bookmarkEnd w:id="1"/>
+      <w:bookmarkEnd w:id="2"/>
     </w:p>
     <w:p>
       <w:pPr>
@@ -840,7 +864,13 @@
         <w:t>, donde primero calcula las transformadas de Fourier de ambas imágenes y luego multiplica la transformada del primero por el conjugado del segundo para conseguir el espectro cruzado. Finalmente</w:t>
       </w:r>
       <w:r>
-        <w:t xml:space="preserve"> hacemos el espectro cruzado normalizado dividiendo el espectro cruzado por su magnitud</w:t>
+        <w:t xml:space="preserve"> hacemos el espectro </w:t>
+      </w:r>
+      <w:r>
+        <w:t>cruzado normalizado dividiendo a</w:t>
+      </w:r>
+      <w:r>
+        <w:t>l espectro cruzado por su magnitud</w:t>
       </w:r>
       <w:r>
         <w:t>.</w:t>
@@ -999,21 +1029,7 @@
         <w:rPr>
           <w:rFonts w:eastAsiaTheme="minorEastAsia"/>
         </w:rPr>
-        <w:t xml:space="preserve"> es la magnitud de la función, podemos observar </w:t>
-      </w:r>
-      <w:proofErr w:type="gramStart"/>
-      <w:r>
-        <w:rPr>
-          <w:rFonts w:eastAsiaTheme="minorEastAsia"/>
-        </w:rPr>
-        <w:t>que</w:t>
-      </w:r>
-      <w:proofErr w:type="gramEnd"/>
-      <w:r>
-        <w:rPr>
-          <w:rFonts w:eastAsiaTheme="minorEastAsia"/>
-        </w:rPr>
-        <w:t xml:space="preserve"> si se traslada, lo que conseguimos es que se mueva el </w:t>
+        <w:t xml:space="preserve"> es la magnitud de la función, podemos observar que si se traslada, lo que conseguimos es que se mueva el </w:t>
       </w:r>
       <m:oMath>
         <m:r>
@@ -1030,26 +1046,21 @@
         <w:t>, o sea, la fase, pero su magnitud sigue invariante.</w:t>
       </w:r>
     </w:p>
-    <w:p/>
     <w:p>
       <w:r>
-        <w:t xml:space="preserve">Luego creamos un programa que a fuerza bruta va comparando distintos desplazamientos </w:t>
-      </w:r>
-      <w:proofErr w:type="gramStart"/>
-      <w:r>
-        <w:t>pixel</w:t>
-      </w:r>
-      <w:proofErr w:type="gramEnd"/>
-      <w:r>
-        <w:t xml:space="preserve"> a </w:t>
-      </w:r>
-      <w:proofErr w:type="gramStart"/>
-      <w:r>
-        <w:t>pixel</w:t>
-      </w:r>
-      <w:proofErr w:type="gramEnd"/>
-      <w:r>
-        <w:t xml:space="preserve"> hasta que encuentra uno que hace coincidir ambas imágenes, que también da un resultado de desplazamiento de 40 y 10 para x e y respectivamente. Este acercamiento es mucho más lento porque tiene que hacer prueba y error hasta que encuentra un match de imágenes y tiene un costo computacional considerablemente más grande.</w:t>
+        <w:t>Luego creamos un programa que a fuerza bruta va comparando distintos desplazamientos pixel a pixel hasta que encuentra uno que hace coincidir ambas imágenes, que también da un resultado de desplazamiento de 40 y 10 para x e y respectivamente. Este acercamiento es mucho más lento porque tiene que hacer prueba y error hasta que encuentra un match de imágenes</w:t>
+      </w:r>
+      <w:r>
+        <w:t>,</w:t>
+      </w:r>
+      <w:r>
+        <w:t xml:space="preserve"> </w:t>
+      </w:r>
+      <w:r>
+        <w:t xml:space="preserve">y también </w:t>
+      </w:r>
+      <w:r>
+        <w:t>tiene un costo computacional considerablemente más grande.</w:t>
       </w:r>
     </w:p>
     <w:p/>
@@ -1057,11 +1068,11 @@
       <w:pPr>
         <w:pStyle w:val="Ttulo1"/>
       </w:pPr>
-      <w:bookmarkStart w:id="2" w:name="_Toc231218694"/>
+      <w:bookmarkStart w:id="3" w:name="_Toc231549185"/>
       <w:r>
         <w:t>Inciso 2:</w:t>
       </w:r>
-      <w:bookmarkEnd w:id="2"/>
+      <w:bookmarkEnd w:id="3"/>
     </w:p>
     <w:p>
       <w:pPr>
@@ -1172,11 +1183,11 @@
       <w:pPr>
         <w:pStyle w:val="Ttulo1"/>
       </w:pPr>
-      <w:bookmarkStart w:id="3" w:name="_Toc231218695"/>
+      <w:bookmarkStart w:id="4" w:name="_Toc231549186"/>
       <w:r>
         <w:t>Inciso 3:</w:t>
       </w:r>
-      <w:bookmarkEnd w:id="3"/>
+      <w:bookmarkEnd w:id="4"/>
     </w:p>
     <w:p>
       <w:pPr>
@@ -1342,11 +1353,11 @@
       <w:pPr>
         <w:pStyle w:val="Ttulo1"/>
       </w:pPr>
-      <w:bookmarkStart w:id="4" w:name="_Toc231218696"/>
+      <w:bookmarkStart w:id="5" w:name="_Toc231549187"/>
       <w:r>
         <w:t>Inciso 4:</w:t>
       </w:r>
-      <w:bookmarkEnd w:id="4"/>
+      <w:bookmarkEnd w:id="5"/>
     </w:p>
     <w:p>
       <w:pPr>
@@ -1818,9 +1829,99 @@
       <w:r>
         <w:t>Imagen Objetivo (TIF):</w:t>
       </w:r>
+      <w:r>
+        <w:t xml:space="preserve"> </w:t>
+      </w:r>
+      <w:r>
+        <w:tab/>
+      </w:r>
+      <w:r>
+        <w:tab/>
+      </w:r>
+      <w:r>
+        <w:tab/>
+        <w:t>Imagen Objetivo (JPG</w:t>
+      </w:r>
+      <w:r>
+        <w:t>):</w:t>
+      </w:r>
     </w:p>
     <w:p>
       <w:r>
+        <w:rPr>
+          <w:noProof/>
+          <w:lang w:eastAsia="es-AR"/>
+        </w:rPr>
+        <w:drawing>
+          <wp:anchor distT="0" distB="0" distL="114300" distR="114300" simplePos="0" relativeHeight="251658240" behindDoc="1" locked="0" layoutInCell="1" allowOverlap="1" wp14:anchorId="1B8C12FA" wp14:editId="5582A5DA">
+            <wp:simplePos x="0" y="0"/>
+            <wp:positionH relativeFrom="margin">
+              <wp:posOffset>2705073</wp:posOffset>
+            </wp:positionH>
+            <wp:positionV relativeFrom="page">
+              <wp:posOffset>7572164</wp:posOffset>
+            </wp:positionV>
+            <wp:extent cx="1645920" cy="1645920"/>
+            <wp:effectExtent l="0" t="0" r="0" b="0"/>
+            <wp:wrapTight wrapText="bothSides">
+              <wp:wrapPolygon edited="0">
+                <wp:start x="0" y="0"/>
+                <wp:lineTo x="0" y="21250"/>
+                <wp:lineTo x="21250" y="21250"/>
+                <wp:lineTo x="21250" y="0"/>
+                <wp:lineTo x="0" y="0"/>
+              </wp:wrapPolygon>
+            </wp:wrapTight>
+            <wp:docPr id="675481517" name="Imagen 4"/>
+            <wp:cNvGraphicFramePr>
+              <a:graphicFrameLocks xmlns:a="http://schemas.openxmlformats.org/drawingml/2006/main" noChangeAspect="1"/>
+            </wp:cNvGraphicFramePr>
+            <a:graphic xmlns:a="http://schemas.openxmlformats.org/drawingml/2006/main">
+              <a:graphicData uri="http://schemas.openxmlformats.org/drawingml/2006/picture">
+                <pic:pic xmlns:pic="http://schemas.openxmlformats.org/drawingml/2006/picture">
+                  <pic:nvPicPr>
+                    <pic:cNvPr id="0" name="Picture 13"/>
+                    <pic:cNvPicPr>
+                      <a:picLocks noChangeAspect="1" noChangeArrowheads="1"/>
+                    </pic:cNvPicPr>
+                  </pic:nvPicPr>
+                  <pic:blipFill>
+                    <a:blip r:embed="rId10">
+                      <a:extLst>
+                        <a:ext uri="{28A0092B-C50C-407E-A947-70E740481C1C}">
+                          <a14:useLocalDpi xmlns:a14="http://schemas.microsoft.com/office/drawing/2010/main" val="0"/>
+                        </a:ext>
+                      </a:extLst>
+                    </a:blip>
+                    <a:srcRect/>
+                    <a:stretch>
+                      <a:fillRect/>
+                    </a:stretch>
+                  </pic:blipFill>
+                  <pic:spPr bwMode="auto">
+                    <a:xfrm>
+                      <a:off x="0" y="0"/>
+                      <a:ext cx="1645920" cy="1645920"/>
+                    </a:xfrm>
+                    <a:prstGeom prst="rect">
+                      <a:avLst/>
+                    </a:prstGeom>
+                    <a:noFill/>
+                    <a:ln>
+                      <a:noFill/>
+                    </a:ln>
+                  </pic:spPr>
+                </pic:pic>
+              </a:graphicData>
+            </a:graphic>
+          </wp:anchor>
+        </w:drawing>
+      </w:r>
+      <w:r>
+        <w:rPr>
+          <w:noProof/>
+          <w:lang w:eastAsia="es-AR"/>
+        </w:rPr>
         <w:drawing>
           <wp:inline distT="0" distB="0" distL="0" distR="0" wp14:anchorId="149A008E" wp14:editId="2583C611">
             <wp:extent cx="1637969" cy="1637969"/>
@@ -1839,7 +1940,7 @@
                     </pic:cNvPicPr>
                   </pic:nvPicPr>
                   <pic:blipFill>
-                    <a:blip r:embed="rId10">
+                    <a:blip r:embed="rId11">
                       <a:extLst>
                         <a:ext uri="{28A0092B-C50C-407E-A947-70E740481C1C}">
                           <a14:useLocalDpi xmlns:a14="http://schemas.microsoft.com/office/drawing/2010/main" val="0"/>
@@ -1872,65 +1973,6 @@
       </w:r>
     </w:p>
     <w:p/>
-    <w:p>
-      <w:r>
-        <w:lastRenderedPageBreak/>
-        <w:t>Imagen Objetivo (PDF):</w:t>
-      </w:r>
-    </w:p>
-    <w:p>
-      <w:r>
-        <w:drawing>
-          <wp:inline distT="0" distB="0" distL="0" distR="0" wp14:anchorId="4F427A75" wp14:editId="231BBAB5">
-            <wp:extent cx="1645920" cy="1645920"/>
-            <wp:effectExtent l="0" t="0" r="0" b="0"/>
-            <wp:docPr id="675481517" name="Imagen 4"/>
-            <wp:cNvGraphicFramePr>
-              <a:graphicFrameLocks xmlns:a="http://schemas.openxmlformats.org/drawingml/2006/main" noChangeAspect="1"/>
-            </wp:cNvGraphicFramePr>
-            <a:graphic xmlns:a="http://schemas.openxmlformats.org/drawingml/2006/main">
-              <a:graphicData uri="http://schemas.openxmlformats.org/drawingml/2006/picture">
-                <pic:pic xmlns:pic="http://schemas.openxmlformats.org/drawingml/2006/picture">
-                  <pic:nvPicPr>
-                    <pic:cNvPr id="0" name="Picture 13"/>
-                    <pic:cNvPicPr>
-                      <a:picLocks noChangeAspect="1" noChangeArrowheads="1"/>
-                    </pic:cNvPicPr>
-                  </pic:nvPicPr>
-                  <pic:blipFill>
-                    <a:blip r:embed="rId11">
-                      <a:extLst>
-                        <a:ext uri="{28A0092B-C50C-407E-A947-70E740481C1C}">
-                          <a14:useLocalDpi xmlns:a14="http://schemas.microsoft.com/office/drawing/2010/main" val="0"/>
-                        </a:ext>
-                      </a:extLst>
-                    </a:blip>
-                    <a:srcRect/>
-                    <a:stretch>
-                      <a:fillRect/>
-                    </a:stretch>
-                  </pic:blipFill>
-                  <pic:spPr bwMode="auto">
-                    <a:xfrm>
-                      <a:off x="0" y="0"/>
-                      <a:ext cx="1650229" cy="1650229"/>
-                    </a:xfrm>
-                    <a:prstGeom prst="rect">
-                      <a:avLst/>
-                    </a:prstGeom>
-                    <a:noFill/>
-                    <a:ln>
-                      <a:noFill/>
-                    </a:ln>
-                  </pic:spPr>
-                </pic:pic>
-              </a:graphicData>
-            </a:graphic>
-          </wp:inline>
-        </w:drawing>
-      </w:r>
-    </w:p>
-    <w:p/>
     <w:sectPr>
       <w:footerReference w:type="default" r:id="rId12"/>
       <w:pgSz w:w="11906" w:h="16838"/>
@@ -1944,7 +1986,7 @@
 </file>
 
 <file path=word/endnotes.xml><?xml version="1.0" encoding="utf-8"?>
-<w:endnotes xmlns:wpc="http://schemas.microsoft.com/office/word/2010/wordprocessingCanvas" xmlns:cx="http://schemas.microsoft.com/office/drawing/2014/chartex" xmlns:cx1="http://schemas.microsoft.com/office/drawing/2015/9/8/chartex" xmlns:cx2="http://schemas.microsoft.com/office/drawing/2015/10/21/chartex" xmlns:cx3="http://schemas.microsoft.com/office/drawing/2016/5/9/chartex" xmlns:cx4="http://schemas.microsoft.com/office/drawing/2016/5/10/chartex" xmlns:cx5="http://schemas.microsoft.com/office/drawing/2016/5/11/chartex" xmlns:cx6="http://schemas.microsoft.com/office/drawing/2016/5/12/chartex" xmlns:cx7="http://schemas.microsoft.com/office/drawing/2016/5/13/chartex" xmlns:cx8="http://schemas.microsoft.com/office/drawing/2016/5/14/chartex" xmlns:mc="http://schemas.openxmlformats.org/markup-compatibility/2006" xmlns:aink="http://schemas.microsoft.com/office/drawing/2016/ink" xmlns:am3d="http://schemas.microsoft.com/office/drawing/2017/model3d" xmlns:o="urn:schemas-microsoft-com:office:office" xmlns:oel="http://schemas.microsoft.com/office/2019/extlst" xmlns:r="http://schemas.openxmlformats.org/officeDocument/2006/relationships" xmlns:m="http://schemas.openxmlformats.org/officeDocument/2006/math" xmlns:v="urn:schemas-microsoft-com:vml" xmlns:wp14="http://schemas.microsoft.com/office/word/2010/wordprocessingDrawing" xmlns:wp="http://schemas.openxmlformats.org/drawingml/2006/wordprocessingDrawing" xmlns:w10="urn:schemas-microsoft-com:office:word" xmlns:w="http://schemas.openxmlformats.org/wordprocessingml/2006/main" xmlns:w14="http://schemas.microsoft.com/office/word/2010/wordml" xmlns:w15="http://schemas.microsoft.com/office/word/2012/wordml" xmlns:w16cex="http://schemas.microsoft.com/office/word/2018/wordml/cex" xmlns:w16cid="http://schemas.microsoft.com/office/word/2016/wordml/cid" xmlns:w16="http://schemas.microsoft.com/office/word/2018/wordml" xmlns:w16du="http://schemas.microsoft.com/office/word/2023/wordml/word16du" xmlns:w16sdtdh="http://schemas.microsoft.com/office/word/2020/wordml/sdtdatahash" xmlns:w16sdtfl="http://schemas.microsoft.com/office/word/2024/wordml/sdtformatlock" xmlns:w16se="http://schemas.microsoft.com/office/word/2015/wordml/symex" xmlns:wpg="http://schemas.microsoft.com/office/word/2010/wordprocessingGroup" xmlns:wpi="http://schemas.microsoft.com/office/word/2010/wordprocessingInk" xmlns:wne="http://schemas.microsoft.com/office/word/2006/wordml" xmlns:wps="http://schemas.microsoft.com/office/word/2010/wordprocessingShape" mc:Ignorable="w14 w15 w16se w16cid w16 w16cex w16sdtdh w16sdtfl w16du wp14">
+<w:endnotes xmlns:wpc="http://schemas.microsoft.com/office/word/2010/wordprocessingCanvas" xmlns:cx="http://schemas.microsoft.com/office/drawing/2014/chartex" xmlns:mc="http://schemas.openxmlformats.org/markup-compatibility/2006" xmlns:o="urn:schemas-microsoft-com:office:office" xmlns:r="http://schemas.openxmlformats.org/officeDocument/2006/relationships" xmlns:m="http://schemas.openxmlformats.org/officeDocument/2006/math" xmlns:v="urn:schemas-microsoft-com:vml" xmlns:wp14="http://schemas.microsoft.com/office/word/2010/wordprocessingDrawing" xmlns:wp="http://schemas.openxmlformats.org/drawingml/2006/wordprocessingDrawing" xmlns:w10="urn:schemas-microsoft-com:office:word" xmlns:w="http://schemas.openxmlformats.org/wordprocessingml/2006/main" xmlns:w14="http://schemas.microsoft.com/office/word/2010/wordml" xmlns:w15="http://schemas.microsoft.com/office/word/2012/wordml" xmlns:w16se="http://schemas.microsoft.com/office/word/2015/wordml/symex" xmlns:wpg="http://schemas.microsoft.com/office/word/2010/wordprocessingGroup" xmlns:wpi="http://schemas.microsoft.com/office/word/2010/wordprocessingInk" xmlns:wne="http://schemas.microsoft.com/office/word/2006/wordml" xmlns:wps="http://schemas.microsoft.com/office/word/2010/wordprocessingShape" mc:Ignorable="w14 w15 w16se wp14">
   <w:endnote w:type="separator" w:id="-1">
     <w:p>
       <w:pPr>
@@ -1969,7 +2011,7 @@
 </file>
 
 <file path=word/footer1.xml><?xml version="1.0" encoding="utf-8"?>
-<w:ftr xmlns:wpc="http://schemas.microsoft.com/office/word/2010/wordprocessingCanvas" xmlns:cx="http://schemas.microsoft.com/office/drawing/2014/chartex" xmlns:cx1="http://schemas.microsoft.com/office/drawing/2015/9/8/chartex" xmlns:cx2="http://schemas.microsoft.com/office/drawing/2015/10/21/chartex" xmlns:cx3="http://schemas.microsoft.com/office/drawing/2016/5/9/chartex" xmlns:cx4="http://schemas.microsoft.com/office/drawing/2016/5/10/chartex" xmlns:cx5="http://schemas.microsoft.com/office/drawing/2016/5/11/chartex" xmlns:cx6="http://schemas.microsoft.com/office/drawing/2016/5/12/chartex" xmlns:cx7="http://schemas.microsoft.com/office/drawing/2016/5/13/chartex" xmlns:cx8="http://schemas.microsoft.com/office/drawing/2016/5/14/chartex" xmlns:mc="http://schemas.openxmlformats.org/markup-compatibility/2006" xmlns:aink="http://schemas.microsoft.com/office/drawing/2016/ink" xmlns:am3d="http://schemas.microsoft.com/office/drawing/2017/model3d" xmlns:o="urn:schemas-microsoft-com:office:office" xmlns:oel="http://schemas.microsoft.com/office/2019/extlst" xmlns:r="http://schemas.openxmlformats.org/officeDocument/2006/relationships" xmlns:m="http://schemas.openxmlformats.org/officeDocument/2006/math" xmlns:v="urn:schemas-microsoft-com:vml" xmlns:wp14="http://schemas.microsoft.com/office/word/2010/wordprocessingDrawing" xmlns:wp="http://schemas.openxmlformats.org/drawingml/2006/wordprocessingDrawing" xmlns:w10="urn:schemas-microsoft-com:office:word" xmlns:w="http://schemas.openxmlformats.org/wordprocessingml/2006/main" xmlns:w14="http://schemas.microsoft.com/office/word/2010/wordml" xmlns:w15="http://schemas.microsoft.com/office/word/2012/wordml" xmlns:w16cex="http://schemas.microsoft.com/office/word/2018/wordml/cex" xmlns:w16cid="http://schemas.microsoft.com/office/word/2016/wordml/cid" xmlns:w16="http://schemas.microsoft.com/office/word/2018/wordml" xmlns:w16du="http://schemas.microsoft.com/office/word/2023/wordml/word16du" xmlns:w16sdtdh="http://schemas.microsoft.com/office/word/2020/wordml/sdtdatahash" xmlns:w16sdtfl="http://schemas.microsoft.com/office/word/2024/wordml/sdtformatlock" xmlns:w16se="http://schemas.microsoft.com/office/word/2015/wordml/symex" xmlns:wpg="http://schemas.microsoft.com/office/word/2010/wordprocessingGroup" xmlns:wpi="http://schemas.microsoft.com/office/word/2010/wordprocessingInk" xmlns:wne="http://schemas.microsoft.com/office/word/2006/wordml" xmlns:wps="http://schemas.microsoft.com/office/word/2010/wordprocessingShape" mc:Ignorable="w14 w15 w16se w16cid w16 w16cex w16sdtdh w16sdtfl w16du wp14">
+<w:ftr xmlns:wpc="http://schemas.microsoft.com/office/word/2010/wordprocessingCanvas" xmlns:cx="http://schemas.microsoft.com/office/drawing/2014/chartex" xmlns:mc="http://schemas.openxmlformats.org/markup-compatibility/2006" xmlns:o="urn:schemas-microsoft-com:office:office" xmlns:r="http://schemas.openxmlformats.org/officeDocument/2006/relationships" xmlns:m="http://schemas.openxmlformats.org/officeDocument/2006/math" xmlns:v="urn:schemas-microsoft-com:vml" xmlns:wp14="http://schemas.microsoft.com/office/word/2010/wordprocessingDrawing" xmlns:wp="http://schemas.openxmlformats.org/drawingml/2006/wordprocessingDrawing" xmlns:w10="urn:schemas-microsoft-com:office:word" xmlns:w="http://schemas.openxmlformats.org/wordprocessingml/2006/main" xmlns:w14="http://schemas.microsoft.com/office/word/2010/wordml" xmlns:w15="http://schemas.microsoft.com/office/word/2012/wordml" xmlns:w16se="http://schemas.microsoft.com/office/word/2015/wordml/symex" xmlns:wpg="http://schemas.microsoft.com/office/word/2010/wordprocessingGroup" xmlns:wpi="http://schemas.microsoft.com/office/word/2010/wordprocessingInk" xmlns:wne="http://schemas.microsoft.com/office/word/2006/wordml" xmlns:wps="http://schemas.microsoft.com/office/word/2010/wordprocessingShape" mc:Ignorable="w14 w15 w16se wp14">
   <w:p>
     <w:pPr>
       <w:tabs>
@@ -2106,7 +2148,7 @@
 </file>
 
 <file path=word/footnotes.xml><?xml version="1.0" encoding="utf-8"?>
-<w:footnotes xmlns:wpc="http://schemas.microsoft.com/office/word/2010/wordprocessingCanvas" xmlns:cx="http://schemas.microsoft.com/office/drawing/2014/chartex" xmlns:cx1="http://schemas.microsoft.com/office/drawing/2015/9/8/chartex" xmlns:cx2="http://schemas.microsoft.com/office/drawing/2015/10/21/chartex" xmlns:cx3="http://schemas.microsoft.com/office/drawing/2016/5/9/chartex" xmlns:cx4="http://schemas.microsoft.com/office/drawing/2016/5/10/chartex" xmlns:cx5="http://schemas.microsoft.com/office/drawing/2016/5/11/chartex" xmlns:cx6="http://schemas.microsoft.com/office/drawing/2016/5/12/chartex" xmlns:cx7="http://schemas.microsoft.com/office/drawing/2016/5/13/chartex" xmlns:cx8="http://schemas.microsoft.com/office/drawing/2016/5/14/chartex" xmlns:mc="http://schemas.openxmlformats.org/markup-compatibility/2006" xmlns:aink="http://schemas.microsoft.com/office/drawing/2016/ink" xmlns:am3d="http://schemas.microsoft.com/office/drawing/2017/model3d" xmlns:o="urn:schemas-microsoft-com:office:office" xmlns:oel="http://schemas.microsoft.com/office/2019/extlst" xmlns:r="http://schemas.openxmlformats.org/officeDocument/2006/relationships" xmlns:m="http://schemas.openxmlformats.org/officeDocument/2006/math" xmlns:v="urn:schemas-microsoft-com:vml" xmlns:wp14="http://schemas.microsoft.com/office/word/2010/wordprocessingDrawing" xmlns:wp="http://schemas.openxmlformats.org/drawingml/2006/wordprocessingDrawing" xmlns:w10="urn:schemas-microsoft-com:office:word" xmlns:w="http://schemas.openxmlformats.org/wordprocessingml/2006/main" xmlns:w14="http://schemas.microsoft.com/office/word/2010/wordml" xmlns:w15="http://schemas.microsoft.com/office/word/2012/wordml" xmlns:w16cex="http://schemas.microsoft.com/office/word/2018/wordml/cex" xmlns:w16cid="http://schemas.microsoft.com/office/word/2016/wordml/cid" xmlns:w16="http://schemas.microsoft.com/office/word/2018/wordml" xmlns:w16du="http://schemas.microsoft.com/office/word/2023/wordml/word16du" xmlns:w16sdtdh="http://schemas.microsoft.com/office/word/2020/wordml/sdtdatahash" xmlns:w16sdtfl="http://schemas.microsoft.com/office/word/2024/wordml/sdtformatlock" xmlns:w16se="http://schemas.microsoft.com/office/word/2015/wordml/symex" xmlns:wpg="http://schemas.microsoft.com/office/word/2010/wordprocessingGroup" xmlns:wpi="http://schemas.microsoft.com/office/word/2010/wordprocessingInk" xmlns:wne="http://schemas.microsoft.com/office/word/2006/wordml" xmlns:wps="http://schemas.microsoft.com/office/word/2010/wordprocessingShape" mc:Ignorable="w14 w15 w16se w16cid w16 w16cex w16sdtdh w16sdtfl w16du wp14">
+<w:footnotes xmlns:wpc="http://schemas.microsoft.com/office/word/2010/wordprocessingCanvas" xmlns:cx="http://schemas.microsoft.com/office/drawing/2014/chartex" xmlns:mc="http://schemas.openxmlformats.org/markup-compatibility/2006" xmlns:o="urn:schemas-microsoft-com:office:office" xmlns:r="http://schemas.openxmlformats.org/officeDocument/2006/relationships" xmlns:m="http://schemas.openxmlformats.org/officeDocument/2006/math" xmlns:v="urn:schemas-microsoft-com:vml" xmlns:wp14="http://schemas.microsoft.com/office/word/2010/wordprocessingDrawing" xmlns:wp="http://schemas.openxmlformats.org/drawingml/2006/wordprocessingDrawing" xmlns:w10="urn:schemas-microsoft-com:office:word" xmlns:w="http://schemas.openxmlformats.org/wordprocessingml/2006/main" xmlns:w14="http://schemas.microsoft.com/office/word/2010/wordml" xmlns:w15="http://schemas.microsoft.com/office/word/2012/wordml" xmlns:w16se="http://schemas.microsoft.com/office/word/2015/wordml/symex" xmlns:wpg="http://schemas.microsoft.com/office/word/2010/wordprocessingGroup" xmlns:wpi="http://schemas.microsoft.com/office/word/2010/wordprocessingInk" xmlns:wne="http://schemas.microsoft.com/office/word/2006/wordml" xmlns:wps="http://schemas.microsoft.com/office/word/2010/wordprocessingShape" mc:Ignorable="w14 w15 w16se wp14">
   <w:footnote w:type="separator" w:id="-1">
     <w:p>
       <w:pPr>
@@ -2131,7 +2173,7 @@
 </file>
 
 <file path=word/numbering.xml><?xml version="1.0" encoding="utf-8"?>
-<w:numbering xmlns:wpc="http://schemas.microsoft.com/office/word/2010/wordprocessingCanvas" xmlns:cx="http://schemas.microsoft.com/office/drawing/2014/chartex" xmlns:cx1="http://schemas.microsoft.com/office/drawing/2015/9/8/chartex" xmlns:cx2="http://schemas.microsoft.com/office/drawing/2015/10/21/chartex" xmlns:cx3="http://schemas.microsoft.com/office/drawing/2016/5/9/chartex" xmlns:cx4="http://schemas.microsoft.com/office/drawing/2016/5/10/chartex" xmlns:cx5="http://schemas.microsoft.com/office/drawing/2016/5/11/chartex" xmlns:cx6="http://schemas.microsoft.com/office/drawing/2016/5/12/chartex" xmlns:cx7="http://schemas.microsoft.com/office/drawing/2016/5/13/chartex" xmlns:cx8="http://schemas.microsoft.com/office/drawing/2016/5/14/chartex" xmlns:mc="http://schemas.openxmlformats.org/markup-compatibility/2006" xmlns:aink="http://schemas.microsoft.com/office/drawing/2016/ink" xmlns:am3d="http://schemas.microsoft.com/office/drawing/2017/model3d" xmlns:o="urn:schemas-microsoft-com:office:office" xmlns:oel="http://schemas.microsoft.com/office/2019/extlst" xmlns:r="http://schemas.openxmlformats.org/officeDocument/2006/relationships" xmlns:m="http://schemas.openxmlformats.org/officeDocument/2006/math" xmlns:v="urn:schemas-microsoft-com:vml" xmlns:wp14="http://schemas.microsoft.com/office/word/2010/wordprocessingDrawing" xmlns:wp="http://schemas.openxmlformats.org/drawingml/2006/wordprocessingDrawing" xmlns:w10="urn:schemas-microsoft-com:office:word" xmlns:w="http://schemas.openxmlformats.org/wordprocessingml/2006/main" xmlns:w14="http://schemas.microsoft.com/office/word/2010/wordml" xmlns:w15="http://schemas.microsoft.com/office/word/2012/wordml" xmlns:w16cex="http://schemas.microsoft.com/office/word/2018/wordml/cex" xmlns:w16cid="http://schemas.microsoft.com/office/word/2016/wordml/cid" xmlns:w16="http://schemas.microsoft.com/office/word/2018/wordml" xmlns:w16du="http://schemas.microsoft.com/office/word/2023/wordml/word16du" xmlns:w16sdtdh="http://schemas.microsoft.com/office/word/2020/wordml/sdtdatahash" xmlns:w16sdtfl="http://schemas.microsoft.com/office/word/2024/wordml/sdtformatlock" xmlns:w16se="http://schemas.microsoft.com/office/word/2015/wordml/symex" xmlns:wpg="http://schemas.microsoft.com/office/word/2010/wordprocessingGroup" xmlns:wpi="http://schemas.microsoft.com/office/word/2010/wordprocessingInk" xmlns:wne="http://schemas.microsoft.com/office/word/2006/wordml" xmlns:wps="http://schemas.microsoft.com/office/word/2010/wordprocessingShape" mc:Ignorable="w14 w15 w16se w16cid w16 w16cex w16sdtdh w16sdtfl w16du wp14">
+<w:numbering xmlns:wpc="http://schemas.microsoft.com/office/word/2010/wordprocessingCanvas" xmlns:cx="http://schemas.microsoft.com/office/drawing/2014/chartex" xmlns:mc="http://schemas.openxmlformats.org/markup-compatibility/2006" xmlns:o="urn:schemas-microsoft-com:office:office" xmlns:r="http://schemas.openxmlformats.org/officeDocument/2006/relationships" xmlns:m="http://schemas.openxmlformats.org/officeDocument/2006/math" xmlns:v="urn:schemas-microsoft-com:vml" xmlns:wp14="http://schemas.microsoft.com/office/word/2010/wordprocessingDrawing" xmlns:wp="http://schemas.openxmlformats.org/drawingml/2006/wordprocessingDrawing" xmlns:w10="urn:schemas-microsoft-com:office:word" xmlns:w="http://schemas.openxmlformats.org/wordprocessingml/2006/main" xmlns:w14="http://schemas.microsoft.com/office/word/2010/wordml" xmlns:w15="http://schemas.microsoft.com/office/word/2012/wordml" xmlns:w16se="http://schemas.microsoft.com/office/word/2015/wordml/symex" xmlns:wpg="http://schemas.microsoft.com/office/word/2010/wordprocessingGroup" xmlns:wpi="http://schemas.microsoft.com/office/word/2010/wordprocessingInk" xmlns:wne="http://schemas.microsoft.com/office/word/2006/wordml" xmlns:wps="http://schemas.microsoft.com/office/word/2010/wordprocessingShape" mc:Ignorable="w14 w15 w16se wp14">
   <w:abstractNum w:abstractNumId="0" w15:restartNumberingAfterBreak="0">
     <w:nsid w:val="0250685B"/>
     <w:multiLevelType w:val="hybridMultilevel"/>
@@ -4766,83 +4808,83 @@
       </w:pPr>
     </w:lvl>
   </w:abstractNum>
-  <w:num w:numId="1" w16cid:durableId="1908876000">
+  <w:num w:numId="1">
     <w:abstractNumId w:val="15"/>
   </w:num>
-  <w:num w:numId="2" w16cid:durableId="229312703">
+  <w:num w:numId="2">
     <w:abstractNumId w:val="11"/>
   </w:num>
-  <w:num w:numId="3" w16cid:durableId="1204096633">
+  <w:num w:numId="3">
     <w:abstractNumId w:val="10"/>
   </w:num>
-  <w:num w:numId="4" w16cid:durableId="446583064">
+  <w:num w:numId="4">
     <w:abstractNumId w:val="13"/>
   </w:num>
-  <w:num w:numId="5" w16cid:durableId="231474129">
+  <w:num w:numId="5">
     <w:abstractNumId w:val="21"/>
   </w:num>
-  <w:num w:numId="6" w16cid:durableId="939458590">
+  <w:num w:numId="6">
     <w:abstractNumId w:val="3"/>
   </w:num>
-  <w:num w:numId="7" w16cid:durableId="89084937">
+  <w:num w:numId="7">
     <w:abstractNumId w:val="14"/>
   </w:num>
-  <w:num w:numId="8" w16cid:durableId="473134233">
+  <w:num w:numId="8">
     <w:abstractNumId w:val="9"/>
   </w:num>
-  <w:num w:numId="9" w16cid:durableId="2003780150">
+  <w:num w:numId="9">
     <w:abstractNumId w:val="4"/>
   </w:num>
-  <w:num w:numId="10" w16cid:durableId="1933540331">
+  <w:num w:numId="10">
     <w:abstractNumId w:val="0"/>
   </w:num>
-  <w:num w:numId="11" w16cid:durableId="832067593">
+  <w:num w:numId="11">
     <w:abstractNumId w:val="23"/>
   </w:num>
-  <w:num w:numId="12" w16cid:durableId="2125269593">
+  <w:num w:numId="12">
     <w:abstractNumId w:val="7"/>
   </w:num>
-  <w:num w:numId="13" w16cid:durableId="1583025199">
+  <w:num w:numId="13">
     <w:abstractNumId w:val="18"/>
   </w:num>
-  <w:num w:numId="14" w16cid:durableId="612135891">
+  <w:num w:numId="14">
     <w:abstractNumId w:val="17"/>
   </w:num>
-  <w:num w:numId="15" w16cid:durableId="459609431">
+  <w:num w:numId="15">
     <w:abstractNumId w:val="12"/>
   </w:num>
-  <w:num w:numId="16" w16cid:durableId="1006402429">
+  <w:num w:numId="16">
     <w:abstractNumId w:val="5"/>
   </w:num>
-  <w:num w:numId="17" w16cid:durableId="1844011505">
+  <w:num w:numId="17">
     <w:abstractNumId w:val="2"/>
   </w:num>
-  <w:num w:numId="18" w16cid:durableId="1254700336">
+  <w:num w:numId="18">
     <w:abstractNumId w:val="19"/>
   </w:num>
-  <w:num w:numId="19" w16cid:durableId="1115059231">
+  <w:num w:numId="19">
     <w:abstractNumId w:val="20"/>
   </w:num>
-  <w:num w:numId="20" w16cid:durableId="383722298">
+  <w:num w:numId="20">
     <w:abstractNumId w:val="6"/>
   </w:num>
-  <w:num w:numId="21" w16cid:durableId="1326980289">
+  <w:num w:numId="21">
     <w:abstractNumId w:val="8"/>
   </w:num>
-  <w:num w:numId="22" w16cid:durableId="313726031">
+  <w:num w:numId="22">
     <w:abstractNumId w:val="16"/>
   </w:num>
-  <w:num w:numId="23" w16cid:durableId="2124494850">
+  <w:num w:numId="23">
     <w:abstractNumId w:val="1"/>
   </w:num>
-  <w:num w:numId="24" w16cid:durableId="1146122685">
+  <w:num w:numId="24">
     <w:abstractNumId w:val="22"/>
   </w:num>
 </w:numbering>
 </file>
 
 <file path=word/styles.xml><?xml version="1.0" encoding="utf-8"?>
-<w:styles xmlns:mc="http://schemas.openxmlformats.org/markup-compatibility/2006" xmlns:r="http://schemas.openxmlformats.org/officeDocument/2006/relationships" xmlns:w="http://schemas.openxmlformats.org/wordprocessingml/2006/main" xmlns:w14="http://schemas.microsoft.com/office/word/2010/wordml" xmlns:w15="http://schemas.microsoft.com/office/word/2012/wordml" xmlns:w16cex="http://schemas.microsoft.com/office/word/2018/wordml/cex" xmlns:w16cid="http://schemas.microsoft.com/office/word/2016/wordml/cid" xmlns:w16="http://schemas.microsoft.com/office/word/2018/wordml" xmlns:w16du="http://schemas.microsoft.com/office/word/2023/wordml/word16du" xmlns:w16sdtdh="http://schemas.microsoft.com/office/word/2020/wordml/sdtdatahash" xmlns:w16sdtfl="http://schemas.microsoft.com/office/word/2024/wordml/sdtformatlock" xmlns:w16se="http://schemas.microsoft.com/office/word/2015/wordml/symex" mc:Ignorable="w14 w15 w16se w16cid w16 w16cex w16sdtdh w16sdtfl w16du">
+<w:styles xmlns:mc="http://schemas.openxmlformats.org/markup-compatibility/2006" xmlns:r="http://schemas.openxmlformats.org/officeDocument/2006/relationships" xmlns:w="http://schemas.openxmlformats.org/wordprocessingml/2006/main" xmlns:w14="http://schemas.microsoft.com/office/word/2010/wordml" xmlns:w15="http://schemas.microsoft.com/office/word/2012/wordml" xmlns:w16se="http://schemas.microsoft.com/office/word/2015/wordml/symex" mc:Ignorable="w14 w15 w16se">
   <w:docDefaults>
     <w:rPrDefault>
       <w:rPr>
@@ -4858,7 +4900,7 @@
       </w:pPr>
     </w:pPrDefault>
   </w:docDefaults>
-  <w:latentStyles w:defLockedState="0" w:defUIPriority="99" w:defSemiHidden="0" w:defUnhideWhenUsed="0" w:defQFormat="0" w:count="376">
+  <w:latentStyles w:defLockedState="0" w:defUIPriority="99" w:defSemiHidden="0" w:defUnhideWhenUsed="0" w:defQFormat="0" w:count="371">
     <w:lsdException w:name="Normal" w:uiPriority="0" w:qFormat="1"/>
     <w:lsdException w:name="heading 1" w:uiPriority="9" w:qFormat="1"/>
     <w:lsdException w:name="heading 2" w:semiHidden="1" w:uiPriority="9" w:unhideWhenUsed="1" w:qFormat="1"/>
@@ -5230,11 +5272,6 @@
     <w:lsdException w:name="List Table 5 Dark Accent 6" w:uiPriority="50"/>
     <w:lsdException w:name="List Table 6 Colorful Accent 6" w:uiPriority="51"/>
     <w:lsdException w:name="List Table 7 Colorful Accent 6" w:uiPriority="52"/>
-    <w:lsdException w:name="Mention" w:semiHidden="1" w:unhideWhenUsed="1"/>
-    <w:lsdException w:name="Smart Hyperlink" w:semiHidden="1" w:unhideWhenUsed="1"/>
-    <w:lsdException w:name="Hashtag" w:semiHidden="1" w:unhideWhenUsed="1"/>
-    <w:lsdException w:name="Unresolved Mention" w:semiHidden="1" w:unhideWhenUsed="1"/>
-    <w:lsdException w:name="Smart Link" w:semiHidden="1" w:unhideWhenUsed="1"/>
   </w:latentStyles>
   <w:style w:type="paragraph" w:default="1" w:styleId="Normal">
     <w:name w:val="Normal"/>
@@ -5295,6 +5332,7 @@
   <w:style w:type="character" w:default="1" w:styleId="Fuentedeprrafopredeter">
     <w:name w:val="Default Paragraph Font"/>
     <w:uiPriority w:val="1"/>
+    <w:semiHidden/>
     <w:unhideWhenUsed/>
   </w:style>
   <w:style w:type="table" w:default="1" w:styleId="Tablanormal">
@@ -5541,7 +5579,7 @@
       <w:contextualSpacing/>
     </w:pPr>
   </w:style>
-  <w:style w:type="character" w:styleId="Fuerte">
+  <w:style w:type="character" w:styleId="Textoennegrita">
     <w:name w:val="Strong"/>
     <w:basedOn w:val="Fuentedeprrafopredeter"/>
     <w:uiPriority w:val="22"/>
@@ -5892,7 +5930,7 @@
 </file>
 
 <file path=customXml/itemProps1.xml><?xml version="1.0" encoding="utf-8"?>
-<ds:datastoreItem xmlns:ds="http://schemas.openxmlformats.org/officeDocument/2006/customXml" ds:itemID="{EBE43E1A-7734-4F78-A5DE-1D4C3E616A6C}">
+<ds:datastoreItem xmlns:ds="http://schemas.openxmlformats.org/officeDocument/2006/customXml" ds:itemID="{3F2CFA55-DE7E-4C03-B95A-284EEC83CE34}">
   <ds:schemaRefs>
     <ds:schemaRef ds:uri="http://schemas.openxmlformats.org/officeDocument/2006/bibliography"/>
   </ds:schemaRefs>

</xml_diff>